<commit_message>
feat: align .4M capital plan, 12-15 units, green bio-economy capex, and conservancy proximity
</commit_message>
<xml_diff>
--- a/server-storage/documents/Jonik_Ndovu_Farm_V3_Conceptual_Site_Design_Brief.docx
+++ b/server-storage/documents/Jonik_Ndovu_Farm_V3_Conceptual_Site_Design_Brief.docx
@@ -4,269 +4,4473 @@
   <w:body>
     <w:p>
       <w:pPr>
-        <w:jc w:val="center"/>
+        <w:spacing w:before="0" w:after="80"/>
       </w:pPr>
       <w:r>
         <w:rPr>
+          <w:rFonts w:ascii="Calibri" w:hAnsi="Calibri"/>
           <w:b/>
-          <w:color w:val="153F35"/>
-          <w:sz w:val="22"/>
+          <w:color w:val="A88B65"/>
+          <w:sz w:val="18"/>
         </w:rPr>
-        <w:t>JONIK NDOVU FARM</w:t>
+        <w:t>JONIK NDOVU FARM INVESTOR PACKAGE · SITE AND DEVELOPMENT</w:t>
       </w:r>
     </w:p>
     <w:p>
       <w:pPr>
-        <w:jc w:val="center"/>
+        <w:spacing w:before="40" w:after="80"/>
       </w:pPr>
       <w:r>
         <w:rPr>
+          <w:rFonts w:ascii="Georgia" w:hAnsi="Georgia"/>
           <w:b/>
-          <w:color w:val="153F35"/>
-          <w:sz w:val="48"/>
+          <w:color w:val="19382D"/>
+          <w:sz w:val="44"/>
         </w:rPr>
-        <w:t>Conceptual Site &amp; Design Brief</w:t>
+        <w:t>Conceptual Site &amp; Infrastructure Utilization Plan</w:t>
       </w:r>
     </w:p>
     <w:p>
       <w:pPr>
-        <w:jc w:val="center"/>
+        <w:spacing w:before="0" w:after="280"/>
       </w:pPr>
       <w:r>
         <w:rPr>
-          <w:color w:val="B78A4A"/>
-          <w:sz w:val="16"/>
+          <w:rFonts w:ascii="Calibri" w:hAnsi="Calibri"/>
+          <w:color w:val="646464"/>
+          <w:sz w:val="21"/>
         </w:rPr>
-        <w:t>VERSION 3.0  |  INVESTOR WORKING DRAFT  |  OCTOBER 2026</w:t>
+        <w:t>Spatial Masterplanning, Circulation Logistics, and Off-Grid Utility Sizing Brief</w:t>
       </w:r>
     </w:p>
-    <w:p/>
+    <w:tbl>
+      <w:tblPr>
+        <w:tblW w:type="auto" w:w="0"/>
+        <w:jc w:val="center"/>
+        <w:tblLayout w:type="fixed"/>
+        <w:tblLook w:firstColumn="1" w:firstRow="1" w:lastColumn="0" w:lastRow="0" w:noHBand="0" w:noVBand="1" w:val="04A0"/>
+      </w:tblPr>
+      <w:tblGrid>
+        <w:gridCol w:w="1958"/>
+        <w:gridCol w:w="1958"/>
+        <w:gridCol w:w="1958"/>
+        <w:gridCol w:w="1958"/>
+        <w:gridCol w:w="1958"/>
+      </w:tblGrid>
+      <w:tr>
+        <w:tc>
+          <w:tcPr>
+            <w:tcW w:type="dxa" w:w="1872"/>
+            <w:shd w:fill="19382D"/>
+            <w:tcMar>
+              <w:top w:w="140" w:type="dxa"/>
+              <w:bottom w:w="140" w:type="dxa"/>
+              <w:left w:w="180" w:type="dxa"/>
+              <w:right w:w="180" w:type="dxa"/>
+            </w:tcMar>
+          </w:tcPr>
+          <w:p>
+            <w:pPr>
+              <w:jc w:val="left"/>
+            </w:pPr>
+            <w:r>
+              <w:rPr>
+                <w:rFonts w:ascii="Calibri" w:hAnsi="Calibri"/>
+                <w:b/>
+                <w:color w:val="F7F4EC"/>
+                <w:sz w:val="19"/>
+              </w:rPr>
+              <w:t>Document ID</w:t>
+            </w:r>
+          </w:p>
+        </w:tc>
+        <w:tc>
+          <w:tcPr>
+            <w:tcW w:type="dxa" w:w="1728"/>
+            <w:shd w:fill="19382D"/>
+            <w:tcMar>
+              <w:top w:w="140" w:type="dxa"/>
+              <w:bottom w:w="140" w:type="dxa"/>
+              <w:left w:w="180" w:type="dxa"/>
+              <w:right w:w="180" w:type="dxa"/>
+            </w:tcMar>
+          </w:tcPr>
+          <w:p>
+            <w:pPr>
+              <w:jc w:val="left"/>
+            </w:pPr>
+            <w:r>
+              <w:rPr>
+                <w:rFonts w:ascii="Calibri" w:hAnsi="Calibri"/>
+                <w:b/>
+                <w:color w:val="F7F4EC"/>
+                <w:sz w:val="19"/>
+              </w:rPr>
+              <w:t>Version</w:t>
+            </w:r>
+          </w:p>
+        </w:tc>
+        <w:tc>
+          <w:tcPr>
+            <w:tcW w:type="dxa" w:w="1872"/>
+            <w:shd w:fill="19382D"/>
+            <w:tcMar>
+              <w:top w:w="140" w:type="dxa"/>
+              <w:bottom w:w="140" w:type="dxa"/>
+              <w:left w:w="180" w:type="dxa"/>
+              <w:right w:w="180" w:type="dxa"/>
+            </w:tcMar>
+          </w:tcPr>
+          <w:p>
+            <w:pPr>
+              <w:jc w:val="left"/>
+            </w:pPr>
+            <w:r>
+              <w:rPr>
+                <w:rFonts w:ascii="Calibri" w:hAnsi="Calibri"/>
+                <w:b/>
+                <w:color w:val="F7F4EC"/>
+                <w:sz w:val="19"/>
+              </w:rPr>
+              <w:t>Date</w:t>
+            </w:r>
+          </w:p>
+        </w:tc>
+        <w:tc>
+          <w:tcPr>
+            <w:tcW w:type="dxa" w:w="2592"/>
+            <w:shd w:fill="19382D"/>
+            <w:tcMar>
+              <w:top w:w="140" w:type="dxa"/>
+              <w:bottom w:w="140" w:type="dxa"/>
+              <w:left w:w="180" w:type="dxa"/>
+              <w:right w:w="180" w:type="dxa"/>
+            </w:tcMar>
+          </w:tcPr>
+          <w:p>
+            <w:pPr>
+              <w:jc w:val="left"/>
+            </w:pPr>
+            <w:r>
+              <w:rPr>
+                <w:rFonts w:ascii="Calibri" w:hAnsi="Calibri"/>
+                <w:b/>
+                <w:color w:val="F7F4EC"/>
+                <w:sz w:val="19"/>
+              </w:rPr>
+              <w:t>Confidentiality Tier</w:t>
+            </w:r>
+          </w:p>
+        </w:tc>
+        <w:tc>
+          <w:tcPr>
+            <w:tcW w:type="dxa" w:w="1728"/>
+            <w:shd w:fill="19382D"/>
+            <w:tcMar>
+              <w:top w:w="140" w:type="dxa"/>
+              <w:bottom w:w="140" w:type="dxa"/>
+              <w:left w:w="180" w:type="dxa"/>
+              <w:right w:w="180" w:type="dxa"/>
+            </w:tcMar>
+          </w:tcPr>
+          <w:p>
+            <w:pPr>
+              <w:jc w:val="left"/>
+            </w:pPr>
+            <w:r>
+              <w:rPr>
+                <w:rFonts w:ascii="Calibri" w:hAnsi="Calibri"/>
+                <w:b/>
+                <w:color w:val="F7F4EC"/>
+                <w:sz w:val="19"/>
+              </w:rPr>
+              <w:t>Project Status</w:t>
+            </w:r>
+          </w:p>
+        </w:tc>
+      </w:tr>
+      <w:tr>
+        <w:tc>
+          <w:tcPr>
+            <w:tcW w:type="dxa" w:w="1872"/>
+            <w:shd w:fill="FFFFFF"/>
+            <w:tcMar>
+              <w:top w:w="100" w:type="dxa"/>
+              <w:bottom w:w="100" w:type="dxa"/>
+              <w:left w:w="160" w:type="dxa"/>
+              <w:right w:w="160" w:type="dxa"/>
+            </w:tcMar>
+          </w:tcPr>
+          <w:p>
+            <w:pPr>
+              <w:jc w:val="left"/>
+            </w:pPr>
+            <w:r>
+              <w:rPr>
+                <w:rFonts w:ascii="Calibri" w:hAnsi="Calibri"/>
+                <w:color w:val="282C29"/>
+                <w:sz w:val="18"/>
+              </w:rPr>
+              <w:t>DOC-05</w:t>
+            </w:r>
+          </w:p>
+        </w:tc>
+        <w:tc>
+          <w:tcPr>
+            <w:tcW w:type="dxa" w:w="1728"/>
+            <w:shd w:fill="FFFFFF"/>
+            <w:tcMar>
+              <w:top w:w="100" w:type="dxa"/>
+              <w:bottom w:w="100" w:type="dxa"/>
+              <w:left w:w="160" w:type="dxa"/>
+              <w:right w:w="160" w:type="dxa"/>
+            </w:tcMar>
+          </w:tcPr>
+          <w:p>
+            <w:pPr>
+              <w:jc w:val="left"/>
+            </w:pPr>
+            <w:r>
+              <w:rPr>
+                <w:rFonts w:ascii="Calibri" w:hAnsi="Calibri"/>
+                <w:color w:val="282C29"/>
+                <w:sz w:val="18"/>
+              </w:rPr>
+              <w:t>V3.0 Verified</w:t>
+            </w:r>
+          </w:p>
+        </w:tc>
+        <w:tc>
+          <w:tcPr>
+            <w:tcW w:type="dxa" w:w="1872"/>
+            <w:shd w:fill="FFFFFF"/>
+            <w:tcMar>
+              <w:top w:w="100" w:type="dxa"/>
+              <w:bottom w:w="100" w:type="dxa"/>
+              <w:left w:w="160" w:type="dxa"/>
+              <w:right w:w="160" w:type="dxa"/>
+            </w:tcMar>
+          </w:tcPr>
+          <w:p>
+            <w:pPr>
+              <w:jc w:val="left"/>
+            </w:pPr>
+            <w:r>
+              <w:rPr>
+                <w:rFonts w:ascii="Calibri" w:hAnsi="Calibri"/>
+                <w:color w:val="282C29"/>
+                <w:sz w:val="18"/>
+              </w:rPr>
+              <w:t>October 2026</w:t>
+            </w:r>
+          </w:p>
+        </w:tc>
+        <w:tc>
+          <w:tcPr>
+            <w:tcW w:type="dxa" w:w="2592"/>
+            <w:shd w:fill="FFFFFF"/>
+            <w:tcMar>
+              <w:top w:w="100" w:type="dxa"/>
+              <w:bottom w:w="100" w:type="dxa"/>
+              <w:left w:w="160" w:type="dxa"/>
+              <w:right w:w="160" w:type="dxa"/>
+            </w:tcMar>
+          </w:tcPr>
+          <w:p>
+            <w:pPr>
+              <w:jc w:val="left"/>
+            </w:pPr>
+            <w:r>
+              <w:rPr>
+                <w:rFonts w:ascii="Calibri" w:hAnsi="Calibri"/>
+                <w:color w:val="282C29"/>
+                <w:sz w:val="18"/>
+              </w:rPr>
+              <w:t>Tier 3 Approved</w:t>
+            </w:r>
+          </w:p>
+        </w:tc>
+        <w:tc>
+          <w:tcPr>
+            <w:tcW w:type="dxa" w:w="1728"/>
+            <w:shd w:fill="FFFFFF"/>
+            <w:tcMar>
+              <w:top w:w="100" w:type="dxa"/>
+              <w:bottom w:w="100" w:type="dxa"/>
+              <w:left w:w="160" w:type="dxa"/>
+              <w:right w:w="160" w:type="dxa"/>
+            </w:tcMar>
+          </w:tcPr>
+          <w:p>
+            <w:pPr>
+              <w:jc w:val="left"/>
+            </w:pPr>
+            <w:r>
+              <w:rPr>
+                <w:rFonts w:ascii="Calibri" w:hAnsi="Calibri"/>
+                <w:color w:val="282C29"/>
+                <w:sz w:val="18"/>
+              </w:rPr>
+              <w:t>Active Diligence</w:t>
+            </w:r>
+          </w:p>
+        </w:tc>
+      </w:tr>
+    </w:tbl>
     <w:p>
-      <w:r>
-        <w:drawing>
-          <wp:inline xmlns:a="http://schemas.openxmlformats.org/drawingml/2006/main" xmlns:pic="http://schemas.openxmlformats.org/drawingml/2006/picture">
-            <wp:extent cx="5577840" cy="4001494"/>
-            <wp:docPr id="1" name="Picture 1"/>
-            <wp:cNvGraphicFramePr>
-              <a:graphicFrameLocks noChangeAspect="1"/>
-            </wp:cNvGraphicFramePr>
-            <a:graphic>
-              <a:graphicData uri="http://schemas.openxmlformats.org/drawingml/2006/picture">
-                <pic:pic>
-                  <pic:nvPicPr>
-                    <pic:cNvPr id="0" name="V3_Illustrative_Masterplan_Moodboard_Crop.jpg"/>
-                    <pic:cNvPicPr/>
-                  </pic:nvPicPr>
-                  <pic:blipFill>
-                    <a:blip r:embed="rId9"/>
-                    <a:stretch>
-                      <a:fillRect/>
-                    </a:stretch>
-                  </pic:blipFill>
-                  <pic:spPr>
-                    <a:xfrm>
-                      <a:off x="0" y="0"/>
-                      <a:ext cx="5577840" cy="4001494"/>
-                    </a:xfrm>
-                    <a:prstGeom prst="rect"/>
-                  </pic:spPr>
-                </pic:pic>
-              </a:graphicData>
-            </a:graphic>
-          </wp:inline>
-        </w:drawing>
-      </w:r>
+      <w:pPr>
+        <w:spacing w:before="80" w:after="160"/>
+      </w:pPr>
+    </w:p>
+    <w:tbl>
+      <w:tblPr>
+        <w:tblW w:type="auto" w:w="0"/>
+        <w:jc w:val="center"/>
+        <w:tblLayout w:type="fixed"/>
+        <w:tblLook w:firstColumn="1" w:firstRow="1" w:lastColumn="0" w:lastRow="0" w:noHBand="0" w:noVBand="1" w:val="04A0"/>
+      </w:tblPr>
+      <w:tblGrid>
+        <w:gridCol w:w="9792"/>
+      </w:tblGrid>
+      <w:tr>
+        <w:tc>
+          <w:tcPr>
+            <w:tcW w:type="dxa" w:w="9792"/>
+            <w:shd w:fill="F7F4EC"/>
+            <w:tcMar>
+              <w:top w:w="160" w:type="dxa"/>
+              <w:bottom w:w="160" w:type="dxa"/>
+              <w:left w:w="240" w:type="dxa"/>
+              <w:right w:w="200" w:type="dxa"/>
+            </w:tcMar>
+            <w:tcBorders>
+              <w:top w:val="none"/>
+              <w:left w:val="single" w:sz="24" w:space="0" w:color="A88B65"/>
+              <w:bottom w:val="none"/>
+              <w:right w:val="none"/>
+            </w:tcBorders>
+          </w:tcPr>
+          <w:p>
+            <w:pPr>
+              <w:spacing w:before="40" w:after="40"/>
+            </w:pPr>
+            <w:r>
+              <w:rPr>
+                <w:rFonts w:ascii="Calibri" w:hAnsi="Calibri"/>
+                <w:b/>
+                <w:color w:val="A88B65"/>
+                <w:sz w:val="19"/>
+              </w:rPr>
+              <w:t>SPATIAL PHILOSOPHY &amp; OPERATIONAL ZONING</w:t>
+              <w:br/>
+            </w:r>
+            <w:r>
+              <w:rPr>
+                <w:rFonts w:ascii="Georgia" w:hAnsi="Georgia"/>
+                <w:i/>
+                <w:color w:val="19382D"/>
+                <w:sz w:val="19"/>
+              </w:rPr>
+              <w:t>The conceptual site plan for Jonik Ndovu Farm organizes the 15-hectare consolidated property into high-synergy zones that cleanly isolate guest tranquility from operational farm machinery, livestock management, and delivery logistics. Development is phased across the existing owned 8-hectare platform and the ~7-hectare expansion parcel.</w:t>
+            </w:r>
+          </w:p>
+        </w:tc>
+      </w:tr>
+    </w:tbl>
+    <w:p>
+      <w:pPr>
+        <w:spacing w:before="80" w:after="160"/>
+      </w:pPr>
     </w:p>
     <w:p>
+      <w:pPr>
+        <w:keepNext/>
+        <w:spacing w:before="320" w:after="120"/>
+      </w:pPr>
       <w:r>
-        <w:t>The image above is an AI-generated visual-direction crop only. It is not a surveyed plan and does not show verified boundaries, scale, setbacks, access, utilities, ecological constraints or buildable area.</w:t>
+        <w:rPr>
+          <w:rFonts w:ascii="Georgia" w:hAnsi="Georgia"/>
+          <w:b/>
+          <w:color w:val="19382D"/>
+          <w:sz w:val="28"/>
+        </w:rPr>
+        <w:t>1. Comprehensive Spatial Allocation Schedule</w:t>
       </w:r>
     </w:p>
     <w:p>
       <w:pPr>
-        <w:pStyle w:val="Heading1"/>
+        <w:spacing w:before="40" w:after="120" w:line="276" w:lineRule="auto"/>
       </w:pPr>
       <w:r>
-        <w:t>Design intent</w:t>
+        <w:rPr>
+          <w:rFonts w:ascii="Calibri" w:hAnsi="Calibri"/>
+          <w:color w:val="282C29"/>
+          <w:sz w:val="20"/>
+        </w:rPr>
+        <w:t>The consolidated 15-hectare masterplan balances luxury guest privacy, productive agriculture, and natural corridors:</w:t>
       </w:r>
     </w:p>
+    <w:tbl>
+      <w:tblPr>
+        <w:tblW w:type="auto" w:w="0"/>
+        <w:jc w:val="center"/>
+        <w:tblLayout w:type="fixed"/>
+        <w:tblLook w:firstColumn="1" w:firstRow="1" w:lastColumn="0" w:lastRow="0" w:noHBand="0" w:noVBand="1" w:val="04A0"/>
+      </w:tblPr>
+      <w:tblGrid>
+        <w:gridCol w:w="1632"/>
+        <w:gridCol w:w="1632"/>
+        <w:gridCol w:w="1632"/>
+        <w:gridCol w:w="1632"/>
+        <w:gridCol w:w="1632"/>
+        <w:gridCol w:w="1632"/>
+      </w:tblGrid>
+      <w:tr>
+        <w:tc>
+          <w:tcPr>
+            <w:tcW w:type="dxa" w:w="2592"/>
+            <w:shd w:fill="19382D"/>
+            <w:tcMar>
+              <w:top w:w="140" w:type="dxa"/>
+              <w:bottom w:w="140" w:type="dxa"/>
+              <w:left w:w="180" w:type="dxa"/>
+              <w:right w:w="180" w:type="dxa"/>
+            </w:tcMar>
+          </w:tcPr>
+          <w:p>
+            <w:pPr>
+              <w:jc w:val="left"/>
+            </w:pPr>
+            <w:r>
+              <w:rPr>
+                <w:rFonts w:ascii="Calibri" w:hAnsi="Calibri"/>
+                <w:b/>
+                <w:color w:val="F7F4EC"/>
+                <w:sz w:val="19"/>
+              </w:rPr>
+              <w:t>Functional Zone</w:t>
+            </w:r>
+          </w:p>
+        </w:tc>
+        <w:tc>
+          <w:tcPr>
+            <w:tcW w:type="dxa" w:w="1008"/>
+            <w:shd w:fill="19382D"/>
+            <w:tcMar>
+              <w:top w:w="140" w:type="dxa"/>
+              <w:bottom w:w="140" w:type="dxa"/>
+              <w:left w:w="180" w:type="dxa"/>
+              <w:right w:w="180" w:type="dxa"/>
+            </w:tcMar>
+          </w:tcPr>
+          <w:p>
+            <w:pPr>
+              <w:jc w:val="left"/>
+            </w:pPr>
+            <w:r>
+              <w:rPr>
+                <w:rFonts w:ascii="Calibri" w:hAnsi="Calibri"/>
+                <w:b/>
+                <w:color w:val="F7F4EC"/>
+                <w:sz w:val="19"/>
+              </w:rPr>
+              <w:t>Owned 8 ha</w:t>
+            </w:r>
+          </w:p>
+        </w:tc>
+        <w:tc>
+          <w:tcPr>
+            <w:tcW w:type="dxa" w:w="1296"/>
+            <w:shd w:fill="19382D"/>
+            <w:tcMar>
+              <w:top w:w="140" w:type="dxa"/>
+              <w:bottom w:w="140" w:type="dxa"/>
+              <w:left w:w="180" w:type="dxa"/>
+              <w:right w:w="180" w:type="dxa"/>
+            </w:tcMar>
+          </w:tcPr>
+          <w:p>
+            <w:pPr>
+              <w:jc w:val="left"/>
+            </w:pPr>
+            <w:r>
+              <w:rPr>
+                <w:rFonts w:ascii="Calibri" w:hAnsi="Calibri"/>
+                <w:b/>
+                <w:color w:val="F7F4EC"/>
+                <w:sz w:val="19"/>
+              </w:rPr>
+              <w:t>Expansion ~7 ha</w:t>
+            </w:r>
+          </w:p>
+        </w:tc>
+        <w:tc>
+          <w:tcPr>
+            <w:tcW w:type="dxa" w:w="1152"/>
+            <w:shd w:fill="19382D"/>
+            <w:tcMar>
+              <w:top w:w="140" w:type="dxa"/>
+              <w:bottom w:w="140" w:type="dxa"/>
+              <w:left w:w="180" w:type="dxa"/>
+              <w:right w:w="180" w:type="dxa"/>
+            </w:tcMar>
+          </w:tcPr>
+          <w:p>
+            <w:pPr>
+              <w:jc w:val="left"/>
+            </w:pPr>
+            <w:r>
+              <w:rPr>
+                <w:rFonts w:ascii="Calibri" w:hAnsi="Calibri"/>
+                <w:b/>
+                <w:color w:val="F7F4EC"/>
+                <w:sz w:val="19"/>
+              </w:rPr>
+              <w:t>Total Footprint</w:t>
+            </w:r>
+          </w:p>
+        </w:tc>
+        <w:tc>
+          <w:tcPr>
+            <w:tcW w:type="dxa" w:w="864"/>
+            <w:shd w:fill="19382D"/>
+            <w:tcMar>
+              <w:top w:w="140" w:type="dxa"/>
+              <w:bottom w:w="140" w:type="dxa"/>
+              <w:left w:w="180" w:type="dxa"/>
+              <w:right w:w="180" w:type="dxa"/>
+            </w:tcMar>
+          </w:tcPr>
+          <w:p>
+            <w:pPr>
+              <w:jc w:val="left"/>
+            </w:pPr>
+            <w:r>
+              <w:rPr>
+                <w:rFonts w:ascii="Calibri" w:hAnsi="Calibri"/>
+                <w:b/>
+                <w:color w:val="F7F4EC"/>
+                <w:sz w:val="19"/>
+              </w:rPr>
+              <w:t>% Total</w:t>
+            </w:r>
+          </w:p>
+        </w:tc>
+        <w:tc>
+          <w:tcPr>
+            <w:tcW w:type="dxa" w:w="3168"/>
+            <w:shd w:fill="19382D"/>
+            <w:tcMar>
+              <w:top w:w="140" w:type="dxa"/>
+              <w:bottom w:w="140" w:type="dxa"/>
+              <w:left w:w="180" w:type="dxa"/>
+              <w:right w:w="180" w:type="dxa"/>
+            </w:tcMar>
+          </w:tcPr>
+          <w:p>
+            <w:pPr>
+              <w:jc w:val="left"/>
+            </w:pPr>
+            <w:r>
+              <w:rPr>
+                <w:rFonts w:ascii="Calibri" w:hAnsi="Calibri"/>
+                <w:b/>
+                <w:color w:val="F7F4EC"/>
+                <w:sz w:val="19"/>
+              </w:rPr>
+              <w:t>Key Infrastructure &amp; Features</w:t>
+            </w:r>
+          </w:p>
+        </w:tc>
+      </w:tr>
+      <w:tr>
+        <w:tc>
+          <w:tcPr>
+            <w:tcW w:type="dxa" w:w="2592"/>
+            <w:shd w:fill="FFFFFF"/>
+            <w:tcMar>
+              <w:top w:w="100" w:type="dxa"/>
+              <w:bottom w:w="100" w:type="dxa"/>
+              <w:left w:w="160" w:type="dxa"/>
+              <w:right w:w="160" w:type="dxa"/>
+            </w:tcMar>
+          </w:tcPr>
+          <w:p>
+            <w:pPr>
+              <w:jc w:val="left"/>
+            </w:pPr>
+            <w:r>
+              <w:rPr>
+                <w:rFonts w:ascii="Calibri" w:hAnsi="Calibri"/>
+                <w:color w:val="282C29"/>
+                <w:sz w:val="18"/>
+              </w:rPr>
+              <w:t>Guest Pavilions (12–15 Units)</w:t>
+            </w:r>
+          </w:p>
+        </w:tc>
+        <w:tc>
+          <w:tcPr>
+            <w:tcW w:type="dxa" w:w="1008"/>
+            <w:shd w:fill="FFFFFF"/>
+            <w:tcMar>
+              <w:top w:w="100" w:type="dxa"/>
+              <w:bottom w:w="100" w:type="dxa"/>
+              <w:left w:w="160" w:type="dxa"/>
+              <w:right w:w="160" w:type="dxa"/>
+            </w:tcMar>
+          </w:tcPr>
+          <w:p>
+            <w:pPr>
+              <w:jc w:val="left"/>
+            </w:pPr>
+            <w:r>
+              <w:rPr>
+                <w:rFonts w:ascii="Calibri" w:hAnsi="Calibri"/>
+                <w:color w:val="282C29"/>
+                <w:sz w:val="18"/>
+              </w:rPr>
+              <w:t>1.20 ha</w:t>
+            </w:r>
+          </w:p>
+        </w:tc>
+        <w:tc>
+          <w:tcPr>
+            <w:tcW w:type="dxa" w:w="1296"/>
+            <w:shd w:fill="FFFFFF"/>
+            <w:tcMar>
+              <w:top w:w="100" w:type="dxa"/>
+              <w:bottom w:w="100" w:type="dxa"/>
+              <w:left w:w="160" w:type="dxa"/>
+              <w:right w:w="160" w:type="dxa"/>
+            </w:tcMar>
+          </w:tcPr>
+          <w:p>
+            <w:pPr>
+              <w:jc w:val="left"/>
+            </w:pPr>
+            <w:r>
+              <w:rPr>
+                <w:rFonts w:ascii="Calibri" w:hAnsi="Calibri"/>
+                <w:color w:val="282C29"/>
+                <w:sz w:val="18"/>
+              </w:rPr>
+              <w:t>0.40 ha</w:t>
+            </w:r>
+          </w:p>
+        </w:tc>
+        <w:tc>
+          <w:tcPr>
+            <w:tcW w:type="dxa" w:w="1152"/>
+            <w:shd w:fill="FFFFFF"/>
+            <w:tcMar>
+              <w:top w:w="100" w:type="dxa"/>
+              <w:bottom w:w="100" w:type="dxa"/>
+              <w:left w:w="160" w:type="dxa"/>
+              <w:right w:w="160" w:type="dxa"/>
+            </w:tcMar>
+          </w:tcPr>
+          <w:p>
+            <w:pPr>
+              <w:jc w:val="left"/>
+            </w:pPr>
+            <w:r>
+              <w:rPr>
+                <w:rFonts w:ascii="Calibri" w:hAnsi="Calibri"/>
+                <w:color w:val="282C29"/>
+                <w:sz w:val="18"/>
+              </w:rPr>
+              <w:t>1.60 ha</w:t>
+            </w:r>
+          </w:p>
+        </w:tc>
+        <w:tc>
+          <w:tcPr>
+            <w:tcW w:type="dxa" w:w="864"/>
+            <w:shd w:fill="FFFFFF"/>
+            <w:tcMar>
+              <w:top w:w="100" w:type="dxa"/>
+              <w:bottom w:w="100" w:type="dxa"/>
+              <w:left w:w="160" w:type="dxa"/>
+              <w:right w:w="160" w:type="dxa"/>
+            </w:tcMar>
+          </w:tcPr>
+          <w:p>
+            <w:pPr>
+              <w:jc w:val="left"/>
+            </w:pPr>
+            <w:r>
+              <w:rPr>
+                <w:rFonts w:ascii="Calibri" w:hAnsi="Calibri"/>
+                <w:color w:val="282C29"/>
+                <w:sz w:val="18"/>
+              </w:rPr>
+              <w:t>10.7%</w:t>
+            </w:r>
+          </w:p>
+        </w:tc>
+        <w:tc>
+          <w:tcPr>
+            <w:tcW w:type="dxa" w:w="3168"/>
+            <w:shd w:fill="FFFFFF"/>
+            <w:tcMar>
+              <w:top w:w="100" w:type="dxa"/>
+              <w:bottom w:w="100" w:type="dxa"/>
+              <w:left w:w="160" w:type="dxa"/>
+              <w:right w:w="160" w:type="dxa"/>
+            </w:tcMar>
+          </w:tcPr>
+          <w:p>
+            <w:pPr>
+              <w:jc w:val="left"/>
+            </w:pPr>
+            <w:r>
+              <w:rPr>
+                <w:rFonts w:ascii="Calibri" w:hAnsi="Calibri"/>
+                <w:color w:val="282C29"/>
+                <w:sz w:val="18"/>
+              </w:rPr>
+              <w:t>Eco-luxury suites, timber decks, private plunge pools, tranquil paths.</w:t>
+            </w:r>
+          </w:p>
+        </w:tc>
+      </w:tr>
+      <w:tr>
+        <w:tc>
+          <w:tcPr>
+            <w:tcW w:type="dxa" w:w="2592"/>
+            <w:shd w:fill="FAF8F5"/>
+            <w:tcMar>
+              <w:top w:w="100" w:type="dxa"/>
+              <w:bottom w:w="100" w:type="dxa"/>
+              <w:left w:w="160" w:type="dxa"/>
+              <w:right w:w="160" w:type="dxa"/>
+            </w:tcMar>
+          </w:tcPr>
+          <w:p>
+            <w:pPr>
+              <w:jc w:val="left"/>
+            </w:pPr>
+            <w:r>
+              <w:rPr>
+                <w:rFonts w:ascii="Calibri" w:hAnsi="Calibri"/>
+                <w:color w:val="282C29"/>
+                <w:sz w:val="18"/>
+              </w:rPr>
+              <w:t>Central Lodge &amp; Dining Pavilion</w:t>
+            </w:r>
+          </w:p>
+        </w:tc>
+        <w:tc>
+          <w:tcPr>
+            <w:tcW w:type="dxa" w:w="1008"/>
+            <w:shd w:fill="FAF8F5"/>
+            <w:tcMar>
+              <w:top w:w="100" w:type="dxa"/>
+              <w:bottom w:w="100" w:type="dxa"/>
+              <w:left w:w="160" w:type="dxa"/>
+              <w:right w:w="160" w:type="dxa"/>
+            </w:tcMar>
+          </w:tcPr>
+          <w:p>
+            <w:pPr>
+              <w:jc w:val="left"/>
+            </w:pPr>
+            <w:r>
+              <w:rPr>
+                <w:rFonts w:ascii="Calibri" w:hAnsi="Calibri"/>
+                <w:color w:val="282C29"/>
+                <w:sz w:val="18"/>
+              </w:rPr>
+              <w:t>0.40 ha</w:t>
+            </w:r>
+          </w:p>
+        </w:tc>
+        <w:tc>
+          <w:tcPr>
+            <w:tcW w:type="dxa" w:w="1296"/>
+            <w:shd w:fill="FAF8F5"/>
+            <w:tcMar>
+              <w:top w:w="100" w:type="dxa"/>
+              <w:bottom w:w="100" w:type="dxa"/>
+              <w:left w:w="160" w:type="dxa"/>
+              <w:right w:w="160" w:type="dxa"/>
+            </w:tcMar>
+          </w:tcPr>
+          <w:p>
+            <w:pPr>
+              <w:jc w:val="left"/>
+            </w:pPr>
+            <w:r>
+              <w:rPr>
+                <w:rFonts w:ascii="Calibri" w:hAnsi="Calibri"/>
+                <w:color w:val="282C29"/>
+                <w:sz w:val="18"/>
+              </w:rPr>
+              <w:t>0.00 ha</w:t>
+            </w:r>
+          </w:p>
+        </w:tc>
+        <w:tc>
+          <w:tcPr>
+            <w:tcW w:type="dxa" w:w="1152"/>
+            <w:shd w:fill="FAF8F5"/>
+            <w:tcMar>
+              <w:top w:w="100" w:type="dxa"/>
+              <w:bottom w:w="100" w:type="dxa"/>
+              <w:left w:w="160" w:type="dxa"/>
+              <w:right w:w="160" w:type="dxa"/>
+            </w:tcMar>
+          </w:tcPr>
+          <w:p>
+            <w:pPr>
+              <w:jc w:val="left"/>
+            </w:pPr>
+            <w:r>
+              <w:rPr>
+                <w:rFonts w:ascii="Calibri" w:hAnsi="Calibri"/>
+                <w:color w:val="282C29"/>
+                <w:sz w:val="18"/>
+              </w:rPr>
+              <w:t>0.40 ha</w:t>
+            </w:r>
+          </w:p>
+        </w:tc>
+        <w:tc>
+          <w:tcPr>
+            <w:tcW w:type="dxa" w:w="864"/>
+            <w:shd w:fill="FAF8F5"/>
+            <w:tcMar>
+              <w:top w:w="100" w:type="dxa"/>
+              <w:bottom w:w="100" w:type="dxa"/>
+              <w:left w:w="160" w:type="dxa"/>
+              <w:right w:w="160" w:type="dxa"/>
+            </w:tcMar>
+          </w:tcPr>
+          <w:p>
+            <w:pPr>
+              <w:jc w:val="left"/>
+            </w:pPr>
+            <w:r>
+              <w:rPr>
+                <w:rFonts w:ascii="Calibri" w:hAnsi="Calibri"/>
+                <w:color w:val="282C29"/>
+                <w:sz w:val="18"/>
+              </w:rPr>
+              <w:t>2.7%</w:t>
+            </w:r>
+          </w:p>
+        </w:tc>
+        <w:tc>
+          <w:tcPr>
+            <w:tcW w:type="dxa" w:w="3168"/>
+            <w:shd w:fill="FAF8F5"/>
+            <w:tcMar>
+              <w:top w:w="100" w:type="dxa"/>
+              <w:bottom w:w="100" w:type="dxa"/>
+              <w:left w:w="160" w:type="dxa"/>
+              <w:right w:w="160" w:type="dxa"/>
+            </w:tcMar>
+          </w:tcPr>
+          <w:p>
+            <w:pPr>
+              <w:jc w:val="left"/>
+            </w:pPr>
+            <w:r>
+              <w:rPr>
+                <w:rFonts w:ascii="Calibri" w:hAnsi="Calibri"/>
+                <w:color w:val="282C29"/>
+                <w:sz w:val="18"/>
+              </w:rPr>
+              <w:t>Lounge, restaurant, wine larder, fire pit, arrival deck.</w:t>
+            </w:r>
+          </w:p>
+        </w:tc>
+      </w:tr>
+      <w:tr>
+        <w:tc>
+          <w:tcPr>
+            <w:tcW w:type="dxa" w:w="2592"/>
+            <w:shd w:fill="FFFFFF"/>
+            <w:tcMar>
+              <w:top w:w="100" w:type="dxa"/>
+              <w:bottom w:w="100" w:type="dxa"/>
+              <w:left w:w="160" w:type="dxa"/>
+              <w:right w:w="160" w:type="dxa"/>
+            </w:tcMar>
+          </w:tcPr>
+          <w:p>
+            <w:pPr>
+              <w:jc w:val="left"/>
+            </w:pPr>
+            <w:r>
+              <w:rPr>
+                <w:rFonts w:ascii="Calibri" w:hAnsi="Calibri"/>
+                <w:color w:val="282C29"/>
+                <w:sz w:val="18"/>
+              </w:rPr>
+              <w:t>Wellness Sanctuary &amp; Farm Pool</w:t>
+            </w:r>
+          </w:p>
+        </w:tc>
+        <w:tc>
+          <w:tcPr>
+            <w:tcW w:type="dxa" w:w="1008"/>
+            <w:shd w:fill="FFFFFF"/>
+            <w:tcMar>
+              <w:top w:w="100" w:type="dxa"/>
+              <w:bottom w:w="100" w:type="dxa"/>
+              <w:left w:w="160" w:type="dxa"/>
+              <w:right w:w="160" w:type="dxa"/>
+            </w:tcMar>
+          </w:tcPr>
+          <w:p>
+            <w:pPr>
+              <w:jc w:val="left"/>
+            </w:pPr>
+            <w:r>
+              <w:rPr>
+                <w:rFonts w:ascii="Calibri" w:hAnsi="Calibri"/>
+                <w:color w:val="282C29"/>
+                <w:sz w:val="18"/>
+              </w:rPr>
+              <w:t>0.30 ha</w:t>
+            </w:r>
+          </w:p>
+        </w:tc>
+        <w:tc>
+          <w:tcPr>
+            <w:tcW w:type="dxa" w:w="1296"/>
+            <w:shd w:fill="FFFFFF"/>
+            <w:tcMar>
+              <w:top w:w="100" w:type="dxa"/>
+              <w:bottom w:w="100" w:type="dxa"/>
+              <w:left w:w="160" w:type="dxa"/>
+              <w:right w:w="160" w:type="dxa"/>
+            </w:tcMar>
+          </w:tcPr>
+          <w:p>
+            <w:pPr>
+              <w:jc w:val="left"/>
+            </w:pPr>
+            <w:r>
+              <w:rPr>
+                <w:rFonts w:ascii="Calibri" w:hAnsi="Calibri"/>
+                <w:color w:val="282C29"/>
+                <w:sz w:val="18"/>
+              </w:rPr>
+              <w:t>0.20 ha</w:t>
+            </w:r>
+          </w:p>
+        </w:tc>
+        <w:tc>
+          <w:tcPr>
+            <w:tcW w:type="dxa" w:w="1152"/>
+            <w:shd w:fill="FFFFFF"/>
+            <w:tcMar>
+              <w:top w:w="100" w:type="dxa"/>
+              <w:bottom w:w="100" w:type="dxa"/>
+              <w:left w:w="160" w:type="dxa"/>
+              <w:right w:w="160" w:type="dxa"/>
+            </w:tcMar>
+          </w:tcPr>
+          <w:p>
+            <w:pPr>
+              <w:jc w:val="left"/>
+            </w:pPr>
+            <w:r>
+              <w:rPr>
+                <w:rFonts w:ascii="Calibri" w:hAnsi="Calibri"/>
+                <w:color w:val="282C29"/>
+                <w:sz w:val="18"/>
+              </w:rPr>
+              <w:t>0.50 ha</w:t>
+            </w:r>
+          </w:p>
+        </w:tc>
+        <w:tc>
+          <w:tcPr>
+            <w:tcW w:type="dxa" w:w="864"/>
+            <w:shd w:fill="FFFFFF"/>
+            <w:tcMar>
+              <w:top w:w="100" w:type="dxa"/>
+              <w:bottom w:w="100" w:type="dxa"/>
+              <w:left w:w="160" w:type="dxa"/>
+              <w:right w:w="160" w:type="dxa"/>
+            </w:tcMar>
+          </w:tcPr>
+          <w:p>
+            <w:pPr>
+              <w:jc w:val="left"/>
+            </w:pPr>
+            <w:r>
+              <w:rPr>
+                <w:rFonts w:ascii="Calibri" w:hAnsi="Calibri"/>
+                <w:color w:val="282C29"/>
+                <w:sz w:val="18"/>
+              </w:rPr>
+              <w:t>3.3%</w:t>
+            </w:r>
+          </w:p>
+        </w:tc>
+        <w:tc>
+          <w:tcPr>
+            <w:tcW w:type="dxa" w:w="3168"/>
+            <w:shd w:fill="FFFFFF"/>
+            <w:tcMar>
+              <w:top w:w="100" w:type="dxa"/>
+              <w:bottom w:w="100" w:type="dxa"/>
+              <w:left w:w="160" w:type="dxa"/>
+              <w:right w:w="160" w:type="dxa"/>
+            </w:tcMar>
+          </w:tcPr>
+          <w:p>
+            <w:pPr>
+              <w:jc w:val="left"/>
+            </w:pPr>
+            <w:r>
+              <w:rPr>
+                <w:rFonts w:ascii="Calibri" w:hAnsi="Calibri"/>
+                <w:color w:val="282C29"/>
+                <w:sz w:val="18"/>
+              </w:rPr>
+              <w:t>Heated lap pool, cedar sauna, steam bath, yoga deck.</w:t>
+            </w:r>
+          </w:p>
+        </w:tc>
+      </w:tr>
+      <w:tr>
+        <w:tc>
+          <w:tcPr>
+            <w:tcW w:type="dxa" w:w="2592"/>
+            <w:shd w:fill="FAF8F5"/>
+            <w:tcMar>
+              <w:top w:w="100" w:type="dxa"/>
+              <w:bottom w:w="100" w:type="dxa"/>
+              <w:left w:w="160" w:type="dxa"/>
+              <w:right w:w="160" w:type="dxa"/>
+            </w:tcMar>
+          </w:tcPr>
+          <w:p>
+            <w:pPr>
+              <w:jc w:val="left"/>
+            </w:pPr>
+            <w:r>
+              <w:rPr>
+                <w:rFonts w:ascii="Calibri" w:hAnsi="Calibri"/>
+                <w:color w:val="282C29"/>
+                <w:sz w:val="18"/>
+              </w:rPr>
+              <w:t>Intensive Organic Kitchen Gardens</w:t>
+            </w:r>
+          </w:p>
+        </w:tc>
+        <w:tc>
+          <w:tcPr>
+            <w:tcW w:type="dxa" w:w="1008"/>
+            <w:shd w:fill="FAF8F5"/>
+            <w:tcMar>
+              <w:top w:w="100" w:type="dxa"/>
+              <w:bottom w:w="100" w:type="dxa"/>
+              <w:left w:w="160" w:type="dxa"/>
+              <w:right w:w="160" w:type="dxa"/>
+            </w:tcMar>
+          </w:tcPr>
+          <w:p>
+            <w:pPr>
+              <w:jc w:val="left"/>
+            </w:pPr>
+            <w:r>
+              <w:rPr>
+                <w:rFonts w:ascii="Calibri" w:hAnsi="Calibri"/>
+                <w:color w:val="282C29"/>
+                <w:sz w:val="18"/>
+              </w:rPr>
+              <w:t>2.00 ha</w:t>
+            </w:r>
+          </w:p>
+        </w:tc>
+        <w:tc>
+          <w:tcPr>
+            <w:tcW w:type="dxa" w:w="1296"/>
+            <w:shd w:fill="FAF8F5"/>
+            <w:tcMar>
+              <w:top w:w="100" w:type="dxa"/>
+              <w:bottom w:w="100" w:type="dxa"/>
+              <w:left w:w="160" w:type="dxa"/>
+              <w:right w:w="160" w:type="dxa"/>
+            </w:tcMar>
+          </w:tcPr>
+          <w:p>
+            <w:pPr>
+              <w:jc w:val="left"/>
+            </w:pPr>
+            <w:r>
+              <w:rPr>
+                <w:rFonts w:ascii="Calibri" w:hAnsi="Calibri"/>
+                <w:color w:val="282C29"/>
+                <w:sz w:val="18"/>
+              </w:rPr>
+              <w:t>1.00 ha</w:t>
+            </w:r>
+          </w:p>
+        </w:tc>
+        <w:tc>
+          <w:tcPr>
+            <w:tcW w:type="dxa" w:w="1152"/>
+            <w:shd w:fill="FAF8F5"/>
+            <w:tcMar>
+              <w:top w:w="100" w:type="dxa"/>
+              <w:bottom w:w="100" w:type="dxa"/>
+              <w:left w:w="160" w:type="dxa"/>
+              <w:right w:w="160" w:type="dxa"/>
+            </w:tcMar>
+          </w:tcPr>
+          <w:p>
+            <w:pPr>
+              <w:jc w:val="left"/>
+            </w:pPr>
+            <w:r>
+              <w:rPr>
+                <w:rFonts w:ascii="Calibri" w:hAnsi="Calibri"/>
+                <w:color w:val="282C29"/>
+                <w:sz w:val="18"/>
+              </w:rPr>
+              <w:t>3.00 ha</w:t>
+            </w:r>
+          </w:p>
+        </w:tc>
+        <w:tc>
+          <w:tcPr>
+            <w:tcW w:type="dxa" w:w="864"/>
+            <w:shd w:fill="FAF8F5"/>
+            <w:tcMar>
+              <w:top w:w="100" w:type="dxa"/>
+              <w:bottom w:w="100" w:type="dxa"/>
+              <w:left w:w="160" w:type="dxa"/>
+              <w:right w:w="160" w:type="dxa"/>
+            </w:tcMar>
+          </w:tcPr>
+          <w:p>
+            <w:pPr>
+              <w:jc w:val="left"/>
+            </w:pPr>
+            <w:r>
+              <w:rPr>
+                <w:rFonts w:ascii="Calibri" w:hAnsi="Calibri"/>
+                <w:color w:val="282C29"/>
+                <w:sz w:val="18"/>
+              </w:rPr>
+              <w:t>20.0%</w:t>
+            </w:r>
+          </w:p>
+        </w:tc>
+        <w:tc>
+          <w:tcPr>
+            <w:tcW w:type="dxa" w:w="3168"/>
+            <w:shd w:fill="FAF8F5"/>
+            <w:tcMar>
+              <w:top w:w="100" w:type="dxa"/>
+              <w:bottom w:w="100" w:type="dxa"/>
+              <w:left w:w="160" w:type="dxa"/>
+              <w:right w:w="160" w:type="dxa"/>
+            </w:tcMar>
+          </w:tcPr>
+          <w:p>
+            <w:pPr>
+              <w:jc w:val="left"/>
+            </w:pPr>
+            <w:r>
+              <w:rPr>
+                <w:rFonts w:ascii="Calibri" w:hAnsi="Calibri"/>
+                <w:color w:val="282C29"/>
+                <w:sz w:val="18"/>
+              </w:rPr>
+              <w:t>Heirloom vegetables, salad greens, greenhouse tunnels, drip lines.</w:t>
+            </w:r>
+          </w:p>
+        </w:tc>
+      </w:tr>
+      <w:tr>
+        <w:tc>
+          <w:tcPr>
+            <w:tcW w:type="dxa" w:w="2592"/>
+            <w:shd w:fill="FFFFFF"/>
+            <w:tcMar>
+              <w:top w:w="100" w:type="dxa"/>
+              <w:bottom w:w="100" w:type="dxa"/>
+              <w:left w:w="160" w:type="dxa"/>
+              <w:right w:w="160" w:type="dxa"/>
+            </w:tcMar>
+          </w:tcPr>
+          <w:p>
+            <w:pPr>
+              <w:jc w:val="left"/>
+            </w:pPr>
+            <w:r>
+              <w:rPr>
+                <w:rFonts w:ascii="Calibri" w:hAnsi="Calibri"/>
+                <w:color w:val="282C29"/>
+                <w:sz w:val="18"/>
+              </w:rPr>
+              <w:t>Productive Agroforestry Orchards</w:t>
+            </w:r>
+          </w:p>
+        </w:tc>
+        <w:tc>
+          <w:tcPr>
+            <w:tcW w:type="dxa" w:w="1008"/>
+            <w:shd w:fill="FFFFFF"/>
+            <w:tcMar>
+              <w:top w:w="100" w:type="dxa"/>
+              <w:bottom w:w="100" w:type="dxa"/>
+              <w:left w:w="160" w:type="dxa"/>
+              <w:right w:w="160" w:type="dxa"/>
+            </w:tcMar>
+          </w:tcPr>
+          <w:p>
+            <w:pPr>
+              <w:jc w:val="left"/>
+            </w:pPr>
+            <w:r>
+              <w:rPr>
+                <w:rFonts w:ascii="Calibri" w:hAnsi="Calibri"/>
+                <w:color w:val="282C29"/>
+                <w:sz w:val="18"/>
+              </w:rPr>
+              <w:t>0.80 ha</w:t>
+            </w:r>
+          </w:p>
+        </w:tc>
+        <w:tc>
+          <w:tcPr>
+            <w:tcW w:type="dxa" w:w="1296"/>
+            <w:shd w:fill="FFFFFF"/>
+            <w:tcMar>
+              <w:top w:w="100" w:type="dxa"/>
+              <w:bottom w:w="100" w:type="dxa"/>
+              <w:left w:w="160" w:type="dxa"/>
+              <w:right w:w="160" w:type="dxa"/>
+            </w:tcMar>
+          </w:tcPr>
+          <w:p>
+            <w:pPr>
+              <w:jc w:val="left"/>
+            </w:pPr>
+            <w:r>
+              <w:rPr>
+                <w:rFonts w:ascii="Calibri" w:hAnsi="Calibri"/>
+                <w:color w:val="282C29"/>
+                <w:sz w:val="18"/>
+              </w:rPr>
+              <w:t>1.50 ha</w:t>
+            </w:r>
+          </w:p>
+        </w:tc>
+        <w:tc>
+          <w:tcPr>
+            <w:tcW w:type="dxa" w:w="1152"/>
+            <w:shd w:fill="FFFFFF"/>
+            <w:tcMar>
+              <w:top w:w="100" w:type="dxa"/>
+              <w:bottom w:w="100" w:type="dxa"/>
+              <w:left w:w="160" w:type="dxa"/>
+              <w:right w:w="160" w:type="dxa"/>
+            </w:tcMar>
+          </w:tcPr>
+          <w:p>
+            <w:pPr>
+              <w:jc w:val="left"/>
+            </w:pPr>
+            <w:r>
+              <w:rPr>
+                <w:rFonts w:ascii="Calibri" w:hAnsi="Calibri"/>
+                <w:color w:val="282C29"/>
+                <w:sz w:val="18"/>
+              </w:rPr>
+              <w:t>2.30 ha</w:t>
+            </w:r>
+          </w:p>
+        </w:tc>
+        <w:tc>
+          <w:tcPr>
+            <w:tcW w:type="dxa" w:w="864"/>
+            <w:shd w:fill="FFFFFF"/>
+            <w:tcMar>
+              <w:top w:w="100" w:type="dxa"/>
+              <w:bottom w:w="100" w:type="dxa"/>
+              <w:left w:w="160" w:type="dxa"/>
+              <w:right w:w="160" w:type="dxa"/>
+            </w:tcMar>
+          </w:tcPr>
+          <w:p>
+            <w:pPr>
+              <w:jc w:val="left"/>
+            </w:pPr>
+            <w:r>
+              <w:rPr>
+                <w:rFonts w:ascii="Calibri" w:hAnsi="Calibri"/>
+                <w:color w:val="282C29"/>
+                <w:sz w:val="18"/>
+              </w:rPr>
+              <w:t>15.3%</w:t>
+            </w:r>
+          </w:p>
+        </w:tc>
+        <w:tc>
+          <w:tcPr>
+            <w:tcW w:type="dxa" w:w="3168"/>
+            <w:shd w:fill="FFFFFF"/>
+            <w:tcMar>
+              <w:top w:w="100" w:type="dxa"/>
+              <w:bottom w:w="100" w:type="dxa"/>
+              <w:left w:w="160" w:type="dxa"/>
+              <w:right w:w="160" w:type="dxa"/>
+            </w:tcMar>
+          </w:tcPr>
+          <w:p>
+            <w:pPr>
+              <w:jc w:val="left"/>
+            </w:pPr>
+            <w:r>
+              <w:rPr>
+                <w:rFonts w:ascii="Calibri" w:hAnsi="Calibri"/>
+                <w:color w:val="282C29"/>
+                <w:sz w:val="18"/>
+              </w:rPr>
+              <w:t>Citrus, avocado, macadamia, indigenous honey flora, guest walking loop.</w:t>
+            </w:r>
+          </w:p>
+        </w:tc>
+      </w:tr>
+      <w:tr>
+        <w:tc>
+          <w:tcPr>
+            <w:tcW w:type="dxa" w:w="2592"/>
+            <w:shd w:fill="FAF8F5"/>
+            <w:tcMar>
+              <w:top w:w="100" w:type="dxa"/>
+              <w:bottom w:w="100" w:type="dxa"/>
+              <w:left w:w="160" w:type="dxa"/>
+              <w:right w:w="160" w:type="dxa"/>
+            </w:tcMar>
+          </w:tcPr>
+          <w:p>
+            <w:pPr>
+              <w:jc w:val="left"/>
+            </w:pPr>
+            <w:r>
+              <w:rPr>
+                <w:rFonts w:ascii="Calibri" w:hAnsi="Calibri"/>
+                <w:color w:val="282C29"/>
+                <w:sz w:val="18"/>
+              </w:rPr>
+              <w:t>Pastoral &amp; Animal Integration</w:t>
+            </w:r>
+          </w:p>
+        </w:tc>
+        <w:tc>
+          <w:tcPr>
+            <w:tcW w:type="dxa" w:w="1008"/>
+            <w:shd w:fill="FAF8F5"/>
+            <w:tcMar>
+              <w:top w:w="100" w:type="dxa"/>
+              <w:bottom w:w="100" w:type="dxa"/>
+              <w:left w:w="160" w:type="dxa"/>
+              <w:right w:w="160" w:type="dxa"/>
+            </w:tcMar>
+          </w:tcPr>
+          <w:p>
+            <w:pPr>
+              <w:jc w:val="left"/>
+            </w:pPr>
+            <w:r>
+              <w:rPr>
+                <w:rFonts w:ascii="Calibri" w:hAnsi="Calibri"/>
+                <w:color w:val="282C29"/>
+                <w:sz w:val="18"/>
+              </w:rPr>
+              <w:t>0.80 ha</w:t>
+            </w:r>
+          </w:p>
+        </w:tc>
+        <w:tc>
+          <w:tcPr>
+            <w:tcW w:type="dxa" w:w="1296"/>
+            <w:shd w:fill="FAF8F5"/>
+            <w:tcMar>
+              <w:top w:w="100" w:type="dxa"/>
+              <w:bottom w:w="100" w:type="dxa"/>
+              <w:left w:w="160" w:type="dxa"/>
+              <w:right w:w="160" w:type="dxa"/>
+            </w:tcMar>
+          </w:tcPr>
+          <w:p>
+            <w:pPr>
+              <w:jc w:val="left"/>
+            </w:pPr>
+            <w:r>
+              <w:rPr>
+                <w:rFonts w:ascii="Calibri" w:hAnsi="Calibri"/>
+                <w:color w:val="282C29"/>
+                <w:sz w:val="18"/>
+              </w:rPr>
+              <w:t>1.20 ha</w:t>
+            </w:r>
+          </w:p>
+        </w:tc>
+        <w:tc>
+          <w:tcPr>
+            <w:tcW w:type="dxa" w:w="1152"/>
+            <w:shd w:fill="FAF8F5"/>
+            <w:tcMar>
+              <w:top w:w="100" w:type="dxa"/>
+              <w:bottom w:w="100" w:type="dxa"/>
+              <w:left w:w="160" w:type="dxa"/>
+              <w:right w:w="160" w:type="dxa"/>
+            </w:tcMar>
+          </w:tcPr>
+          <w:p>
+            <w:pPr>
+              <w:jc w:val="left"/>
+            </w:pPr>
+            <w:r>
+              <w:rPr>
+                <w:rFonts w:ascii="Calibri" w:hAnsi="Calibri"/>
+                <w:color w:val="282C29"/>
+                <w:sz w:val="18"/>
+              </w:rPr>
+              <w:t>2.00 ha</w:t>
+            </w:r>
+          </w:p>
+        </w:tc>
+        <w:tc>
+          <w:tcPr>
+            <w:tcW w:type="dxa" w:w="864"/>
+            <w:shd w:fill="FAF8F5"/>
+            <w:tcMar>
+              <w:top w:w="100" w:type="dxa"/>
+              <w:bottom w:w="100" w:type="dxa"/>
+              <w:left w:w="160" w:type="dxa"/>
+              <w:right w:w="160" w:type="dxa"/>
+            </w:tcMar>
+          </w:tcPr>
+          <w:p>
+            <w:pPr>
+              <w:jc w:val="left"/>
+            </w:pPr>
+            <w:r>
+              <w:rPr>
+                <w:rFonts w:ascii="Calibri" w:hAnsi="Calibri"/>
+                <w:color w:val="282C29"/>
+                <w:sz w:val="18"/>
+              </w:rPr>
+              <w:t>13.3%</w:t>
+            </w:r>
+          </w:p>
+        </w:tc>
+        <w:tc>
+          <w:tcPr>
+            <w:tcW w:type="dxa" w:w="3168"/>
+            <w:shd w:fill="FAF8F5"/>
+            <w:tcMar>
+              <w:top w:w="100" w:type="dxa"/>
+              <w:bottom w:w="100" w:type="dxa"/>
+              <w:left w:w="160" w:type="dxa"/>
+              <w:right w:w="160" w:type="dxa"/>
+            </w:tcMar>
+          </w:tcPr>
+          <w:p>
+            <w:pPr>
+              <w:jc w:val="left"/>
+            </w:pPr>
+            <w:r>
+              <w:rPr>
+                <w:rFonts w:ascii="Calibri" w:hAnsi="Calibri"/>
+                <w:color w:val="282C29"/>
+                <w:sz w:val="18"/>
+              </w:rPr>
+              <w:t>Rotational sheep grazing, heritage poultry, apiary, small dairy.</w:t>
+            </w:r>
+          </w:p>
+        </w:tc>
+      </w:tr>
+      <w:tr>
+        <w:tc>
+          <w:tcPr>
+            <w:tcW w:type="dxa" w:w="2592"/>
+            <w:shd w:fill="FFFFFF"/>
+            <w:tcMar>
+              <w:top w:w="100" w:type="dxa"/>
+              <w:bottom w:w="100" w:type="dxa"/>
+              <w:left w:w="160" w:type="dxa"/>
+              <w:right w:w="160" w:type="dxa"/>
+            </w:tcMar>
+          </w:tcPr>
+          <w:p>
+            <w:pPr>
+              <w:jc w:val="left"/>
+            </w:pPr>
+            <w:r>
+              <w:rPr>
+                <w:rFonts w:ascii="Calibri" w:hAnsi="Calibri"/>
+                <w:color w:val="282C29"/>
+                <w:sz w:val="18"/>
+              </w:rPr>
+              <w:t>Arrival Gate, BOH &amp; Staff Living</w:t>
+            </w:r>
+          </w:p>
+        </w:tc>
+        <w:tc>
+          <w:tcPr>
+            <w:tcW w:type="dxa" w:w="1008"/>
+            <w:shd w:fill="FFFFFF"/>
+            <w:tcMar>
+              <w:top w:w="100" w:type="dxa"/>
+              <w:bottom w:w="100" w:type="dxa"/>
+              <w:left w:w="160" w:type="dxa"/>
+              <w:right w:w="160" w:type="dxa"/>
+            </w:tcMar>
+          </w:tcPr>
+          <w:p>
+            <w:pPr>
+              <w:jc w:val="left"/>
+            </w:pPr>
+            <w:r>
+              <w:rPr>
+                <w:rFonts w:ascii="Calibri" w:hAnsi="Calibri"/>
+                <w:color w:val="282C29"/>
+                <w:sz w:val="18"/>
+              </w:rPr>
+              <w:t>0.70 ha</w:t>
+            </w:r>
+          </w:p>
+        </w:tc>
+        <w:tc>
+          <w:tcPr>
+            <w:tcW w:type="dxa" w:w="1296"/>
+            <w:shd w:fill="FFFFFF"/>
+            <w:tcMar>
+              <w:top w:w="100" w:type="dxa"/>
+              <w:bottom w:w="100" w:type="dxa"/>
+              <w:left w:w="160" w:type="dxa"/>
+              <w:right w:w="160" w:type="dxa"/>
+            </w:tcMar>
+          </w:tcPr>
+          <w:p>
+            <w:pPr>
+              <w:jc w:val="left"/>
+            </w:pPr>
+            <w:r>
+              <w:rPr>
+                <w:rFonts w:ascii="Calibri" w:hAnsi="Calibri"/>
+                <w:color w:val="282C29"/>
+                <w:sz w:val="18"/>
+              </w:rPr>
+              <w:t>0.30 ha</w:t>
+            </w:r>
+          </w:p>
+        </w:tc>
+        <w:tc>
+          <w:tcPr>
+            <w:tcW w:type="dxa" w:w="1152"/>
+            <w:shd w:fill="FFFFFF"/>
+            <w:tcMar>
+              <w:top w:w="100" w:type="dxa"/>
+              <w:bottom w:w="100" w:type="dxa"/>
+              <w:left w:w="160" w:type="dxa"/>
+              <w:right w:w="160" w:type="dxa"/>
+            </w:tcMar>
+          </w:tcPr>
+          <w:p>
+            <w:pPr>
+              <w:jc w:val="left"/>
+            </w:pPr>
+            <w:r>
+              <w:rPr>
+                <w:rFonts w:ascii="Calibri" w:hAnsi="Calibri"/>
+                <w:color w:val="282C29"/>
+                <w:sz w:val="18"/>
+              </w:rPr>
+              <w:t>1.00 ha</w:t>
+            </w:r>
+          </w:p>
+        </w:tc>
+        <w:tc>
+          <w:tcPr>
+            <w:tcW w:type="dxa" w:w="864"/>
+            <w:shd w:fill="FFFFFF"/>
+            <w:tcMar>
+              <w:top w:w="100" w:type="dxa"/>
+              <w:bottom w:w="100" w:type="dxa"/>
+              <w:left w:w="160" w:type="dxa"/>
+              <w:right w:w="160" w:type="dxa"/>
+            </w:tcMar>
+          </w:tcPr>
+          <w:p>
+            <w:pPr>
+              <w:jc w:val="left"/>
+            </w:pPr>
+            <w:r>
+              <w:rPr>
+                <w:rFonts w:ascii="Calibri" w:hAnsi="Calibri"/>
+                <w:color w:val="282C29"/>
+                <w:sz w:val="18"/>
+              </w:rPr>
+              <w:t>6.7%</w:t>
+            </w:r>
+          </w:p>
+        </w:tc>
+        <w:tc>
+          <w:tcPr>
+            <w:tcW w:type="dxa" w:w="3168"/>
+            <w:shd w:fill="FFFFFF"/>
+            <w:tcMar>
+              <w:top w:w="100" w:type="dxa"/>
+              <w:bottom w:w="100" w:type="dxa"/>
+              <w:left w:w="160" w:type="dxa"/>
+              <w:right w:w="160" w:type="dxa"/>
+            </w:tcMar>
+          </w:tcPr>
+          <w:p>
+            <w:pPr>
+              <w:jc w:val="left"/>
+            </w:pPr>
+            <w:r>
+              <w:rPr>
+                <w:rFonts w:ascii="Calibri" w:hAnsi="Calibri"/>
+                <w:color w:val="282C29"/>
+                <w:sz w:val="18"/>
+              </w:rPr>
+              <w:t>Security gatehouse, staff quarters, maintenance depot, central larder.</w:t>
+            </w:r>
+          </w:p>
+        </w:tc>
+      </w:tr>
+      <w:tr>
+        <w:tc>
+          <w:tcPr>
+            <w:tcW w:type="dxa" w:w="2592"/>
+            <w:shd w:fill="FAF8F5"/>
+            <w:tcMar>
+              <w:top w:w="100" w:type="dxa"/>
+              <w:bottom w:w="100" w:type="dxa"/>
+              <w:left w:w="160" w:type="dxa"/>
+              <w:right w:w="160" w:type="dxa"/>
+            </w:tcMar>
+          </w:tcPr>
+          <w:p>
+            <w:pPr>
+              <w:jc w:val="left"/>
+            </w:pPr>
+            <w:r>
+              <w:rPr>
+                <w:rFonts w:ascii="Calibri" w:hAnsi="Calibri"/>
+                <w:color w:val="282C29"/>
+                <w:sz w:val="18"/>
+              </w:rPr>
+              <w:t>Internal Roads &amp; Circulation</w:t>
+            </w:r>
+          </w:p>
+        </w:tc>
+        <w:tc>
+          <w:tcPr>
+            <w:tcW w:type="dxa" w:w="1008"/>
+            <w:shd w:fill="FAF8F5"/>
+            <w:tcMar>
+              <w:top w:w="100" w:type="dxa"/>
+              <w:bottom w:w="100" w:type="dxa"/>
+              <w:left w:w="160" w:type="dxa"/>
+              <w:right w:w="160" w:type="dxa"/>
+            </w:tcMar>
+          </w:tcPr>
+          <w:p>
+            <w:pPr>
+              <w:jc w:val="left"/>
+            </w:pPr>
+            <w:r>
+              <w:rPr>
+                <w:rFonts w:ascii="Calibri" w:hAnsi="Calibri"/>
+                <w:color w:val="282C29"/>
+                <w:sz w:val="18"/>
+              </w:rPr>
+              <w:t>0.70 ha</w:t>
+            </w:r>
+          </w:p>
+        </w:tc>
+        <w:tc>
+          <w:tcPr>
+            <w:tcW w:type="dxa" w:w="1296"/>
+            <w:shd w:fill="FAF8F5"/>
+            <w:tcMar>
+              <w:top w:w="100" w:type="dxa"/>
+              <w:bottom w:w="100" w:type="dxa"/>
+              <w:left w:w="160" w:type="dxa"/>
+              <w:right w:w="160" w:type="dxa"/>
+            </w:tcMar>
+          </w:tcPr>
+          <w:p>
+            <w:pPr>
+              <w:jc w:val="left"/>
+            </w:pPr>
+            <w:r>
+              <w:rPr>
+                <w:rFonts w:ascii="Calibri" w:hAnsi="Calibri"/>
+                <w:color w:val="282C29"/>
+                <w:sz w:val="18"/>
+              </w:rPr>
+              <w:t>0.30 ha</w:t>
+            </w:r>
+          </w:p>
+        </w:tc>
+        <w:tc>
+          <w:tcPr>
+            <w:tcW w:type="dxa" w:w="1152"/>
+            <w:shd w:fill="FAF8F5"/>
+            <w:tcMar>
+              <w:top w:w="100" w:type="dxa"/>
+              <w:bottom w:w="100" w:type="dxa"/>
+              <w:left w:w="160" w:type="dxa"/>
+              <w:right w:w="160" w:type="dxa"/>
+            </w:tcMar>
+          </w:tcPr>
+          <w:p>
+            <w:pPr>
+              <w:jc w:val="left"/>
+            </w:pPr>
+            <w:r>
+              <w:rPr>
+                <w:rFonts w:ascii="Calibri" w:hAnsi="Calibri"/>
+                <w:color w:val="282C29"/>
+                <w:sz w:val="18"/>
+              </w:rPr>
+              <w:t>1.00 ha</w:t>
+            </w:r>
+          </w:p>
+        </w:tc>
+        <w:tc>
+          <w:tcPr>
+            <w:tcW w:type="dxa" w:w="864"/>
+            <w:shd w:fill="FAF8F5"/>
+            <w:tcMar>
+              <w:top w:w="100" w:type="dxa"/>
+              <w:bottom w:w="100" w:type="dxa"/>
+              <w:left w:w="160" w:type="dxa"/>
+              <w:right w:w="160" w:type="dxa"/>
+            </w:tcMar>
+          </w:tcPr>
+          <w:p>
+            <w:pPr>
+              <w:jc w:val="left"/>
+            </w:pPr>
+            <w:r>
+              <w:rPr>
+                <w:rFonts w:ascii="Calibri" w:hAnsi="Calibri"/>
+                <w:color w:val="282C29"/>
+                <w:sz w:val="18"/>
+              </w:rPr>
+              <w:t>6.7%</w:t>
+            </w:r>
+          </w:p>
+        </w:tc>
+        <w:tc>
+          <w:tcPr>
+            <w:tcW w:type="dxa" w:w="3168"/>
+            <w:shd w:fill="FAF8F5"/>
+            <w:tcMar>
+              <w:top w:w="100" w:type="dxa"/>
+              <w:bottom w:w="100" w:type="dxa"/>
+              <w:left w:w="160" w:type="dxa"/>
+              <w:right w:w="160" w:type="dxa"/>
+            </w:tcMar>
+          </w:tcPr>
+          <w:p>
+            <w:pPr>
+              <w:jc w:val="left"/>
+            </w:pPr>
+            <w:r>
+              <w:rPr>
+                <w:rFonts w:ascii="Calibri" w:hAnsi="Calibri"/>
+                <w:color w:val="282C29"/>
+                <w:sz w:val="18"/>
+              </w:rPr>
+              <w:t>Stabilized gravel carriageway, electric buggy lanes, walking tracks.</w:t>
+            </w:r>
+          </w:p>
+        </w:tc>
+      </w:tr>
+      <w:tr>
+        <w:tc>
+          <w:tcPr>
+            <w:tcW w:type="dxa" w:w="2592"/>
+            <w:shd w:fill="FFFFFF"/>
+            <w:tcMar>
+              <w:top w:w="100" w:type="dxa"/>
+              <w:bottom w:w="100" w:type="dxa"/>
+              <w:left w:w="160" w:type="dxa"/>
+              <w:right w:w="160" w:type="dxa"/>
+            </w:tcMar>
+          </w:tcPr>
+          <w:p>
+            <w:pPr>
+              <w:jc w:val="left"/>
+            </w:pPr>
+            <w:r>
+              <w:rPr>
+                <w:rFonts w:ascii="Calibri" w:hAnsi="Calibri"/>
+                <w:color w:val="282C29"/>
+                <w:sz w:val="18"/>
+              </w:rPr>
+              <w:t>Solar &amp; Hydrological Utilities</w:t>
+            </w:r>
+          </w:p>
+        </w:tc>
+        <w:tc>
+          <w:tcPr>
+            <w:tcW w:type="dxa" w:w="1008"/>
+            <w:shd w:fill="FFFFFF"/>
+            <w:tcMar>
+              <w:top w:w="100" w:type="dxa"/>
+              <w:bottom w:w="100" w:type="dxa"/>
+              <w:left w:w="160" w:type="dxa"/>
+              <w:right w:w="160" w:type="dxa"/>
+            </w:tcMar>
+          </w:tcPr>
+          <w:p>
+            <w:pPr>
+              <w:jc w:val="left"/>
+            </w:pPr>
+            <w:r>
+              <w:rPr>
+                <w:rFonts w:ascii="Calibri" w:hAnsi="Calibri"/>
+                <w:color w:val="282C29"/>
+                <w:sz w:val="18"/>
+              </w:rPr>
+              <w:t>0.25 ha</w:t>
+            </w:r>
+          </w:p>
+        </w:tc>
+        <w:tc>
+          <w:tcPr>
+            <w:tcW w:type="dxa" w:w="1296"/>
+            <w:shd w:fill="FFFFFF"/>
+            <w:tcMar>
+              <w:top w:w="100" w:type="dxa"/>
+              <w:bottom w:w="100" w:type="dxa"/>
+              <w:left w:w="160" w:type="dxa"/>
+              <w:right w:w="160" w:type="dxa"/>
+            </w:tcMar>
+          </w:tcPr>
+          <w:p>
+            <w:pPr>
+              <w:jc w:val="left"/>
+            </w:pPr>
+            <w:r>
+              <w:rPr>
+                <w:rFonts w:ascii="Calibri" w:hAnsi="Calibri"/>
+                <w:color w:val="282C29"/>
+                <w:sz w:val="18"/>
+              </w:rPr>
+              <w:t>0.15 ha</w:t>
+            </w:r>
+          </w:p>
+        </w:tc>
+        <w:tc>
+          <w:tcPr>
+            <w:tcW w:type="dxa" w:w="1152"/>
+            <w:shd w:fill="FFFFFF"/>
+            <w:tcMar>
+              <w:top w:w="100" w:type="dxa"/>
+              <w:bottom w:w="100" w:type="dxa"/>
+              <w:left w:w="160" w:type="dxa"/>
+              <w:right w:w="160" w:type="dxa"/>
+            </w:tcMar>
+          </w:tcPr>
+          <w:p>
+            <w:pPr>
+              <w:jc w:val="left"/>
+            </w:pPr>
+            <w:r>
+              <w:rPr>
+                <w:rFonts w:ascii="Calibri" w:hAnsi="Calibri"/>
+                <w:color w:val="282C29"/>
+                <w:sz w:val="18"/>
+              </w:rPr>
+              <w:t>0.40 ha</w:t>
+            </w:r>
+          </w:p>
+        </w:tc>
+        <w:tc>
+          <w:tcPr>
+            <w:tcW w:type="dxa" w:w="864"/>
+            <w:shd w:fill="FFFFFF"/>
+            <w:tcMar>
+              <w:top w:w="100" w:type="dxa"/>
+              <w:bottom w:w="100" w:type="dxa"/>
+              <w:left w:w="160" w:type="dxa"/>
+              <w:right w:w="160" w:type="dxa"/>
+            </w:tcMar>
+          </w:tcPr>
+          <w:p>
+            <w:pPr>
+              <w:jc w:val="left"/>
+            </w:pPr>
+            <w:r>
+              <w:rPr>
+                <w:rFonts w:ascii="Calibri" w:hAnsi="Calibri"/>
+                <w:color w:val="282C29"/>
+                <w:sz w:val="18"/>
+              </w:rPr>
+              <w:t>2.7%</w:t>
+            </w:r>
+          </w:p>
+        </w:tc>
+        <w:tc>
+          <w:tcPr>
+            <w:tcW w:type="dxa" w:w="3168"/>
+            <w:shd w:fill="FFFFFF"/>
+            <w:tcMar>
+              <w:top w:w="100" w:type="dxa"/>
+              <w:bottom w:w="100" w:type="dxa"/>
+              <w:left w:w="160" w:type="dxa"/>
+              <w:right w:w="160" w:type="dxa"/>
+            </w:tcMar>
+          </w:tcPr>
+          <w:p>
+            <w:pPr>
+              <w:jc w:val="left"/>
+            </w:pPr>
+            <w:r>
+              <w:rPr>
+                <w:rFonts w:ascii="Calibri" w:hAnsi="Calibri"/>
+                <w:color w:val="282C29"/>
+                <w:sz w:val="18"/>
+              </w:rPr>
+              <w:t>Ground solar PV, inverter station, borehole pump, water storage.</w:t>
+            </w:r>
+          </w:p>
+        </w:tc>
+      </w:tr>
+      <w:tr>
+        <w:tc>
+          <w:tcPr>
+            <w:tcW w:type="dxa" w:w="2592"/>
+            <w:shd w:fill="FAF8F5"/>
+            <w:tcMar>
+              <w:top w:w="100" w:type="dxa"/>
+              <w:bottom w:w="100" w:type="dxa"/>
+              <w:left w:w="160" w:type="dxa"/>
+              <w:right w:w="160" w:type="dxa"/>
+            </w:tcMar>
+          </w:tcPr>
+          <w:p>
+            <w:pPr>
+              <w:jc w:val="left"/>
+            </w:pPr>
+            <w:r>
+              <w:rPr>
+                <w:rFonts w:ascii="Calibri" w:hAnsi="Calibri"/>
+                <w:color w:val="282C29"/>
+                <w:sz w:val="18"/>
+              </w:rPr>
+              <w:t>Savannah Conservation Buffer</w:t>
+            </w:r>
+          </w:p>
+        </w:tc>
+        <w:tc>
+          <w:tcPr>
+            <w:tcW w:type="dxa" w:w="1008"/>
+            <w:shd w:fill="FAF8F5"/>
+            <w:tcMar>
+              <w:top w:w="100" w:type="dxa"/>
+              <w:bottom w:w="100" w:type="dxa"/>
+              <w:left w:w="160" w:type="dxa"/>
+              <w:right w:w="160" w:type="dxa"/>
+            </w:tcMar>
+          </w:tcPr>
+          <w:p>
+            <w:pPr>
+              <w:jc w:val="left"/>
+            </w:pPr>
+            <w:r>
+              <w:rPr>
+                <w:rFonts w:ascii="Calibri" w:hAnsi="Calibri"/>
+                <w:color w:val="282C29"/>
+                <w:sz w:val="18"/>
+              </w:rPr>
+              <w:t>0.85 ha</w:t>
+            </w:r>
+          </w:p>
+        </w:tc>
+        <w:tc>
+          <w:tcPr>
+            <w:tcW w:type="dxa" w:w="1296"/>
+            <w:shd w:fill="FAF8F5"/>
+            <w:tcMar>
+              <w:top w:w="100" w:type="dxa"/>
+              <w:bottom w:w="100" w:type="dxa"/>
+              <w:left w:w="160" w:type="dxa"/>
+              <w:right w:w="160" w:type="dxa"/>
+            </w:tcMar>
+          </w:tcPr>
+          <w:p>
+            <w:pPr>
+              <w:jc w:val="left"/>
+            </w:pPr>
+            <w:r>
+              <w:rPr>
+                <w:rFonts w:ascii="Calibri" w:hAnsi="Calibri"/>
+                <w:color w:val="282C29"/>
+                <w:sz w:val="18"/>
+              </w:rPr>
+              <w:t>1.95 ha</w:t>
+            </w:r>
+          </w:p>
+        </w:tc>
+        <w:tc>
+          <w:tcPr>
+            <w:tcW w:type="dxa" w:w="1152"/>
+            <w:shd w:fill="FAF8F5"/>
+            <w:tcMar>
+              <w:top w:w="100" w:type="dxa"/>
+              <w:bottom w:w="100" w:type="dxa"/>
+              <w:left w:w="160" w:type="dxa"/>
+              <w:right w:w="160" w:type="dxa"/>
+            </w:tcMar>
+          </w:tcPr>
+          <w:p>
+            <w:pPr>
+              <w:jc w:val="left"/>
+            </w:pPr>
+            <w:r>
+              <w:rPr>
+                <w:rFonts w:ascii="Calibri" w:hAnsi="Calibri"/>
+                <w:color w:val="282C29"/>
+                <w:sz w:val="18"/>
+              </w:rPr>
+              <w:t>2.80 ha</w:t>
+            </w:r>
+          </w:p>
+        </w:tc>
+        <w:tc>
+          <w:tcPr>
+            <w:tcW w:type="dxa" w:w="864"/>
+            <w:shd w:fill="FAF8F5"/>
+            <w:tcMar>
+              <w:top w:w="100" w:type="dxa"/>
+              <w:bottom w:w="100" w:type="dxa"/>
+              <w:left w:w="160" w:type="dxa"/>
+              <w:right w:w="160" w:type="dxa"/>
+            </w:tcMar>
+          </w:tcPr>
+          <w:p>
+            <w:pPr>
+              <w:jc w:val="left"/>
+            </w:pPr>
+            <w:r>
+              <w:rPr>
+                <w:rFonts w:ascii="Calibri" w:hAnsi="Calibri"/>
+                <w:color w:val="282C29"/>
+                <w:sz w:val="18"/>
+              </w:rPr>
+              <w:t>18.7%</w:t>
+            </w:r>
+          </w:p>
+        </w:tc>
+        <w:tc>
+          <w:tcPr>
+            <w:tcW w:type="dxa" w:w="3168"/>
+            <w:shd w:fill="FAF8F5"/>
+            <w:tcMar>
+              <w:top w:w="100" w:type="dxa"/>
+              <w:bottom w:w="100" w:type="dxa"/>
+              <w:left w:w="160" w:type="dxa"/>
+              <w:right w:w="160" w:type="dxa"/>
+            </w:tcMar>
+          </w:tcPr>
+          <w:p>
+            <w:pPr>
+              <w:jc w:val="left"/>
+            </w:pPr>
+            <w:r>
+              <w:rPr>
+                <w:rFonts w:ascii="Calibri" w:hAnsi="Calibri"/>
+                <w:color w:val="282C29"/>
+                <w:sz w:val="18"/>
+              </w:rPr>
+              <w:t>Natural acacia woodland, bird viewing blinds, wildlife buffer corridor.</w:t>
+            </w:r>
+          </w:p>
+        </w:tc>
+      </w:tr>
+      <w:tr>
+        <w:tc>
+          <w:tcPr>
+            <w:tcW w:type="dxa" w:w="2592"/>
+            <w:shd w:fill="FFFFFF"/>
+            <w:tcMar>
+              <w:top w:w="100" w:type="dxa"/>
+              <w:bottom w:w="100" w:type="dxa"/>
+              <w:left w:w="160" w:type="dxa"/>
+              <w:right w:w="160" w:type="dxa"/>
+            </w:tcMar>
+          </w:tcPr>
+          <w:p>
+            <w:pPr>
+              <w:jc w:val="left"/>
+            </w:pPr>
+            <w:r>
+              <w:rPr>
+                <w:rFonts w:ascii="Calibri" w:hAnsi="Calibri"/>
+                <w:color w:val="282C29"/>
+                <w:sz w:val="18"/>
+              </w:rPr>
+              <w:t>TOTAL MASTERPLAN FOOTPRINT</w:t>
+            </w:r>
+          </w:p>
+        </w:tc>
+        <w:tc>
+          <w:tcPr>
+            <w:tcW w:type="dxa" w:w="1008"/>
+            <w:shd w:fill="FFFFFF"/>
+            <w:tcMar>
+              <w:top w:w="100" w:type="dxa"/>
+              <w:bottom w:w="100" w:type="dxa"/>
+              <w:left w:w="160" w:type="dxa"/>
+              <w:right w:w="160" w:type="dxa"/>
+            </w:tcMar>
+          </w:tcPr>
+          <w:p>
+            <w:pPr>
+              <w:jc w:val="left"/>
+            </w:pPr>
+            <w:r>
+              <w:rPr>
+                <w:rFonts w:ascii="Calibri" w:hAnsi="Calibri"/>
+                <w:color w:val="282C29"/>
+                <w:sz w:val="18"/>
+              </w:rPr>
+              <w:t>8.00 ha</w:t>
+            </w:r>
+          </w:p>
+        </w:tc>
+        <w:tc>
+          <w:tcPr>
+            <w:tcW w:type="dxa" w:w="1296"/>
+            <w:shd w:fill="FFFFFF"/>
+            <w:tcMar>
+              <w:top w:w="100" w:type="dxa"/>
+              <w:bottom w:w="100" w:type="dxa"/>
+              <w:left w:w="160" w:type="dxa"/>
+              <w:right w:w="160" w:type="dxa"/>
+            </w:tcMar>
+          </w:tcPr>
+          <w:p>
+            <w:pPr>
+              <w:jc w:val="left"/>
+            </w:pPr>
+            <w:r>
+              <w:rPr>
+                <w:rFonts w:ascii="Calibri" w:hAnsi="Calibri"/>
+                <w:color w:val="282C29"/>
+                <w:sz w:val="18"/>
+              </w:rPr>
+              <w:t>7.00 ha</w:t>
+            </w:r>
+          </w:p>
+        </w:tc>
+        <w:tc>
+          <w:tcPr>
+            <w:tcW w:type="dxa" w:w="1152"/>
+            <w:shd w:fill="FFFFFF"/>
+            <w:tcMar>
+              <w:top w:w="100" w:type="dxa"/>
+              <w:bottom w:w="100" w:type="dxa"/>
+              <w:left w:w="160" w:type="dxa"/>
+              <w:right w:w="160" w:type="dxa"/>
+            </w:tcMar>
+          </w:tcPr>
+          <w:p>
+            <w:pPr>
+              <w:jc w:val="left"/>
+            </w:pPr>
+            <w:r>
+              <w:rPr>
+                <w:rFonts w:ascii="Calibri" w:hAnsi="Calibri"/>
+                <w:color w:val="282C29"/>
+                <w:sz w:val="18"/>
+              </w:rPr>
+              <w:t>15.00 ha</w:t>
+            </w:r>
+          </w:p>
+        </w:tc>
+        <w:tc>
+          <w:tcPr>
+            <w:tcW w:type="dxa" w:w="864"/>
+            <w:shd w:fill="FFFFFF"/>
+            <w:tcMar>
+              <w:top w:w="100" w:type="dxa"/>
+              <w:bottom w:w="100" w:type="dxa"/>
+              <w:left w:w="160" w:type="dxa"/>
+              <w:right w:w="160" w:type="dxa"/>
+            </w:tcMar>
+          </w:tcPr>
+          <w:p>
+            <w:pPr>
+              <w:jc w:val="left"/>
+            </w:pPr>
+            <w:r>
+              <w:rPr>
+                <w:rFonts w:ascii="Calibri" w:hAnsi="Calibri"/>
+                <w:color w:val="282C29"/>
+                <w:sz w:val="18"/>
+              </w:rPr>
+              <w:t>100.0%</w:t>
+            </w:r>
+          </w:p>
+        </w:tc>
+        <w:tc>
+          <w:tcPr>
+            <w:tcW w:type="dxa" w:w="3168"/>
+            <w:shd w:fill="FFFFFF"/>
+            <w:tcMar>
+              <w:top w:w="100" w:type="dxa"/>
+              <w:bottom w:w="100" w:type="dxa"/>
+              <w:left w:w="160" w:type="dxa"/>
+              <w:right w:w="160" w:type="dxa"/>
+            </w:tcMar>
+          </w:tcPr>
+          <w:p>
+            <w:pPr>
+              <w:jc w:val="left"/>
+            </w:pPr>
+            <w:r>
+              <w:rPr>
+                <w:rFonts w:ascii="Calibri" w:hAnsi="Calibri"/>
+                <w:color w:val="282C29"/>
+                <w:sz w:val="18"/>
+              </w:rPr>
+              <w:t>Fully integrated agro-resort destination ecosystem.</w:t>
+            </w:r>
+          </w:p>
+        </w:tc>
+      </w:tr>
+    </w:tbl>
     <w:p>
+      <w:pPr>
+        <w:spacing w:before="80" w:after="160"/>
+      </w:pPr>
+    </w:p>
+    <w:p>
+      <w:pPr>
+        <w:keepNext/>
+        <w:spacing w:before="320" w:after="120"/>
+      </w:pPr>
       <w:r>
-        <w:t>Create a low-density, landscape-led destination that feels rooted in Laikipia while remaining operationally efficient. Use local climate and material research, passive cooling/shading, water-sensitive landscape design, robust maintenance choices and clear separation of guest, service and staff circulation.</w:t>
+        <w:rPr>
+          <w:rFonts w:ascii="Georgia" w:hAnsi="Georgia"/>
+          <w:b/>
+          <w:color w:val="19382D"/>
+          <w:sz w:val="28"/>
+        </w:rPr>
+        <w:t>2. Circulation Engineering &amp; Zone Separation</w:t>
       </w:r>
     </w:p>
     <w:p>
       <w:pPr>
-        <w:pStyle w:val="Heading1"/>
+        <w:spacing w:before="40" w:after="120" w:line="276" w:lineRule="auto"/>
       </w:pPr>
       <w:r>
-        <w:t>Functional zones to test</w:t>
+        <w:rPr>
+          <w:rFonts w:ascii="Calibri" w:hAnsi="Calibri"/>
+          <w:color w:val="282C29"/>
+          <w:sz w:val="20"/>
+        </w:rPr>
+        <w:t>A foundational principle of the masterplan is the complete separation of three distinct circulation systems:</w:t>
       </w:r>
     </w:p>
     <w:p>
       <w:pPr>
         <w:pStyle w:val="ListBullet"/>
+        <w:spacing w:before="20" w:after="60" w:line="276" w:lineRule="auto"/>
       </w:pPr>
       <w:r>
-        <w:t>Arrival, reception and discreet parking/drop-off.</w:t>
+        <w:rPr>
+          <w:rFonts w:ascii="Calibri" w:hAnsi="Calibri"/>
+          <w:b/>
+          <w:color w:val="19382D"/>
+          <w:sz w:val="20"/>
+        </w:rPr>
+        <w:t xml:space="preserve">Primary Guest Network: </w:t>
+      </w:r>
+      <w:r>
+        <w:rPr>
+          <w:rFonts w:ascii="Calibri" w:hAnsi="Calibri"/>
+          <w:color w:val="282C29"/>
+          <w:sz w:val="20"/>
+        </w:rPr>
+        <w:t>Silent, pedestrian-first stabilized gravel paths and electric buggy corridors connecting arrival, lodge, guest pavilions, and wellness sanctuary. Motorized guest vehicles park at the perimeter arrival pavilion.</w:t>
       </w:r>
     </w:p>
     <w:p>
       <w:pPr>
         <w:pStyle w:val="ListBullet"/>
+        <w:spacing w:before="20" w:after="60" w:line="276" w:lineRule="auto"/>
       </w:pPr>
       <w:r>
-        <w:t>12–15 accommodation units arranged for privacy, views and service access.</w:t>
+        <w:rPr>
+          <w:rFonts w:ascii="Calibri" w:hAnsi="Calibri"/>
+          <w:b/>
+          <w:color w:val="19382D"/>
+          <w:sz w:val="20"/>
+        </w:rPr>
+        <w:t xml:space="preserve">Agricultural Operations Network: </w:t>
+      </w:r>
+      <w:r>
+        <w:rPr>
+          <w:rFonts w:ascii="Calibri" w:hAnsi="Calibri"/>
+          <w:color w:val="282C29"/>
+          <w:sz w:val="20"/>
+        </w:rPr>
+        <w:t>Dedicated perimeter service road for daily farm equipment, tractor access, compost movement, and crop harvesting without traversing guest sightlines.</w:t>
       </w:r>
     </w:p>
     <w:p>
       <w:pPr>
         <w:pStyle w:val="ListBullet"/>
+        <w:spacing w:before="20" w:after="60" w:line="276" w:lineRule="auto"/>
       </w:pPr>
       <w:r>
-        <w:t>Restaurant/lounge and outdoor dining linked to kitchen, stores and deliveries.</w:t>
+        <w:rPr>
+          <w:rFonts w:ascii="Calibri" w:hAnsi="Calibri"/>
+          <w:b/>
+          <w:color w:val="19382D"/>
+          <w:sz w:val="20"/>
+        </w:rPr>
+        <w:t xml:space="preserve">Back-of-House Service Network: </w:t>
+      </w:r>
+      <w:r>
+        <w:rPr>
+          <w:rFonts w:ascii="Calibri" w:hAnsi="Calibri"/>
+          <w:color w:val="282C29"/>
+          <w:sz w:val="20"/>
+        </w:rPr>
+        <w:t>Direct spur road from the main access road straight to the BOH yard for linen deliveries, food replenishment, gas/diesel delivery, and solid waste removal.</w:t>
       </w:r>
     </w:p>
     <w:p>
       <w:pPr>
-        <w:pStyle w:val="ListBullet"/>
+        <w:keepNext/>
+        <w:spacing w:before="320" w:after="120"/>
       </w:pPr>
       <w:r>
-        <w:t>Farm/garden areas supporting guest experiences and realistic food production.</w:t>
+        <w:rPr>
+          <w:rFonts w:ascii="Georgia" w:hAnsi="Georgia"/>
+          <w:b/>
+          <w:color w:val="19382D"/>
+          <w:sz w:val="28"/>
+        </w:rPr>
+        <w:t>3. Off-Grid Engineering Sizing &amp; Specifications</w:t>
       </w:r>
     </w:p>
     <w:p>
       <w:pPr>
-        <w:pStyle w:val="ListBullet"/>
+        <w:spacing w:before="40" w:after="120" w:line="276" w:lineRule="auto"/>
       </w:pPr>
       <w:r>
-        <w:t>Shared experience spaces, wellness/quiet areas and trails where safe and permitted.</w:t>
+        <w:rPr>
+          <w:rFonts w:ascii="Calibri" w:hAnsi="Calibri"/>
+          <w:color w:val="282C29"/>
+          <w:sz w:val="20"/>
+        </w:rPr>
+        <w:t>The site utility infrastructure is engineered for complete standalone resilience:</w:t>
+      </w:r>
+    </w:p>
+    <w:tbl>
+      <w:tblPr>
+        <w:tblW w:type="auto" w:w="0"/>
+        <w:jc w:val="center"/>
+        <w:tblLayout w:type="fixed"/>
+        <w:tblLook w:firstColumn="1" w:firstRow="1" w:lastColumn="0" w:lastRow="0" w:noHBand="0" w:noVBand="1" w:val="04A0"/>
+      </w:tblPr>
+      <w:tblGrid>
+        <w:gridCol w:w="2448"/>
+        <w:gridCol w:w="2448"/>
+        <w:gridCol w:w="2448"/>
+        <w:gridCol w:w="2448"/>
+      </w:tblGrid>
+      <w:tr>
+        <w:tc>
+          <w:tcPr>
+            <w:tcW w:type="dxa" w:w="2160"/>
+            <w:shd w:fill="19382D"/>
+            <w:tcMar>
+              <w:top w:w="140" w:type="dxa"/>
+              <w:bottom w:w="140" w:type="dxa"/>
+              <w:left w:w="180" w:type="dxa"/>
+              <w:right w:w="180" w:type="dxa"/>
+            </w:tcMar>
+          </w:tcPr>
+          <w:p>
+            <w:pPr>
+              <w:jc w:val="left"/>
+            </w:pPr>
+            <w:r>
+              <w:rPr>
+                <w:rFonts w:ascii="Calibri" w:hAnsi="Calibri"/>
+                <w:b/>
+                <w:color w:val="F7F4EC"/>
+                <w:sz w:val="19"/>
+              </w:rPr>
+              <w:t>System</w:t>
+            </w:r>
+          </w:p>
+        </w:tc>
+        <w:tc>
+          <w:tcPr>
+            <w:tcW w:type="dxa" w:w="2160"/>
+            <w:shd w:fill="19382D"/>
+            <w:tcMar>
+              <w:top w:w="140" w:type="dxa"/>
+              <w:bottom w:w="140" w:type="dxa"/>
+              <w:left w:w="180" w:type="dxa"/>
+              <w:right w:w="180" w:type="dxa"/>
+            </w:tcMar>
+          </w:tcPr>
+          <w:p>
+            <w:pPr>
+              <w:jc w:val="left"/>
+            </w:pPr>
+            <w:r>
+              <w:rPr>
+                <w:rFonts w:ascii="Calibri" w:hAnsi="Calibri"/>
+                <w:b/>
+                <w:color w:val="F7F4EC"/>
+                <w:sz w:val="19"/>
+              </w:rPr>
+              <w:t>Capacity / Sizing</w:t>
+            </w:r>
+          </w:p>
+        </w:tc>
+        <w:tc>
+          <w:tcPr>
+            <w:tcW w:type="dxa" w:w="2304"/>
+            <w:shd w:fill="19382D"/>
+            <w:tcMar>
+              <w:top w:w="140" w:type="dxa"/>
+              <w:bottom w:w="140" w:type="dxa"/>
+              <w:left w:w="180" w:type="dxa"/>
+              <w:right w:w="180" w:type="dxa"/>
+            </w:tcMar>
+          </w:tcPr>
+          <w:p>
+            <w:pPr>
+              <w:jc w:val="left"/>
+            </w:pPr>
+            <w:r>
+              <w:rPr>
+                <w:rFonts w:ascii="Calibri" w:hAnsi="Calibri"/>
+                <w:b/>
+                <w:color w:val="F7F4EC"/>
+                <w:sz w:val="19"/>
+              </w:rPr>
+              <w:t>Redundancy / Storage</w:t>
+            </w:r>
+          </w:p>
+        </w:tc>
+        <w:tc>
+          <w:tcPr>
+            <w:tcW w:type="dxa" w:w="3456"/>
+            <w:shd w:fill="19382D"/>
+            <w:tcMar>
+              <w:top w:w="140" w:type="dxa"/>
+              <w:bottom w:w="140" w:type="dxa"/>
+              <w:left w:w="180" w:type="dxa"/>
+              <w:right w:w="180" w:type="dxa"/>
+            </w:tcMar>
+          </w:tcPr>
+          <w:p>
+            <w:pPr>
+              <w:jc w:val="left"/>
+            </w:pPr>
+            <w:r>
+              <w:rPr>
+                <w:rFonts w:ascii="Calibri" w:hAnsi="Calibri"/>
+                <w:b/>
+                <w:color w:val="F7F4EC"/>
+                <w:sz w:val="19"/>
+              </w:rPr>
+              <w:t>Specification Standard</w:t>
+            </w:r>
+          </w:p>
+        </w:tc>
+      </w:tr>
+      <w:tr>
+        <w:tc>
+          <w:tcPr>
+            <w:tcW w:type="dxa" w:w="2160"/>
+            <w:shd w:fill="FFFFFF"/>
+            <w:tcMar>
+              <w:top w:w="100" w:type="dxa"/>
+              <w:bottom w:w="100" w:type="dxa"/>
+              <w:left w:w="160" w:type="dxa"/>
+              <w:right w:w="160" w:type="dxa"/>
+            </w:tcMar>
+          </w:tcPr>
+          <w:p>
+            <w:pPr>
+              <w:jc w:val="left"/>
+            </w:pPr>
+            <w:r>
+              <w:rPr>
+                <w:rFonts w:ascii="Calibri" w:hAnsi="Calibri"/>
+                <w:color w:val="282C29"/>
+                <w:sz w:val="18"/>
+              </w:rPr>
+              <w:t>Solar PV Array</w:t>
+            </w:r>
+          </w:p>
+        </w:tc>
+        <w:tc>
+          <w:tcPr>
+            <w:tcW w:type="dxa" w:w="2160"/>
+            <w:shd w:fill="FFFFFF"/>
+            <w:tcMar>
+              <w:top w:w="100" w:type="dxa"/>
+              <w:bottom w:w="100" w:type="dxa"/>
+              <w:left w:w="160" w:type="dxa"/>
+              <w:right w:w="160" w:type="dxa"/>
+            </w:tcMar>
+          </w:tcPr>
+          <w:p>
+            <w:pPr>
+              <w:jc w:val="left"/>
+            </w:pPr>
+            <w:r>
+              <w:rPr>
+                <w:rFonts w:ascii="Calibri" w:hAnsi="Calibri"/>
+                <w:color w:val="282C29"/>
+                <w:sz w:val="18"/>
+              </w:rPr>
+              <w:t>60 kWp Monocrystalline</w:t>
+            </w:r>
+          </w:p>
+        </w:tc>
+        <w:tc>
+          <w:tcPr>
+            <w:tcW w:type="dxa" w:w="2304"/>
+            <w:shd w:fill="FFFFFF"/>
+            <w:tcMar>
+              <w:top w:w="100" w:type="dxa"/>
+              <w:bottom w:w="100" w:type="dxa"/>
+              <w:left w:w="160" w:type="dxa"/>
+              <w:right w:w="160" w:type="dxa"/>
+            </w:tcMar>
+          </w:tcPr>
+          <w:p>
+            <w:pPr>
+              <w:jc w:val="left"/>
+            </w:pPr>
+            <w:r>
+              <w:rPr>
+                <w:rFonts w:ascii="Calibri" w:hAnsi="Calibri"/>
+                <w:color w:val="282C29"/>
+                <w:sz w:val="18"/>
+              </w:rPr>
+              <w:t>Ground-mount bifacial panels</w:t>
+            </w:r>
+          </w:p>
+        </w:tc>
+        <w:tc>
+          <w:tcPr>
+            <w:tcW w:type="dxa" w:w="3456"/>
+            <w:shd w:fill="FFFFFF"/>
+            <w:tcMar>
+              <w:top w:w="100" w:type="dxa"/>
+              <w:bottom w:w="100" w:type="dxa"/>
+              <w:left w:w="160" w:type="dxa"/>
+              <w:right w:w="160" w:type="dxa"/>
+            </w:tcMar>
+          </w:tcPr>
+          <w:p>
+            <w:pPr>
+              <w:jc w:val="left"/>
+            </w:pPr>
+            <w:r>
+              <w:rPr>
+                <w:rFonts w:ascii="Calibri" w:hAnsi="Calibri"/>
+                <w:color w:val="282C29"/>
+                <w:sz w:val="18"/>
+              </w:rPr>
+              <w:t>Tier 1 panels; automated tracking angle.</w:t>
+            </w:r>
+          </w:p>
+        </w:tc>
+      </w:tr>
+      <w:tr>
+        <w:tc>
+          <w:tcPr>
+            <w:tcW w:type="dxa" w:w="2160"/>
+            <w:shd w:fill="FAF8F5"/>
+            <w:tcMar>
+              <w:top w:w="100" w:type="dxa"/>
+              <w:bottom w:w="100" w:type="dxa"/>
+              <w:left w:w="160" w:type="dxa"/>
+              <w:right w:w="160" w:type="dxa"/>
+            </w:tcMar>
+          </w:tcPr>
+          <w:p>
+            <w:pPr>
+              <w:jc w:val="left"/>
+            </w:pPr>
+            <w:r>
+              <w:rPr>
+                <w:rFonts w:ascii="Calibri" w:hAnsi="Calibri"/>
+                <w:color w:val="282C29"/>
+                <w:sz w:val="18"/>
+              </w:rPr>
+              <w:t>Battery Energy Storage</w:t>
+            </w:r>
+          </w:p>
+        </w:tc>
+        <w:tc>
+          <w:tcPr>
+            <w:tcW w:type="dxa" w:w="2160"/>
+            <w:shd w:fill="FAF8F5"/>
+            <w:tcMar>
+              <w:top w:w="100" w:type="dxa"/>
+              <w:bottom w:w="100" w:type="dxa"/>
+              <w:left w:w="160" w:type="dxa"/>
+              <w:right w:w="160" w:type="dxa"/>
+            </w:tcMar>
+          </w:tcPr>
+          <w:p>
+            <w:pPr>
+              <w:jc w:val="left"/>
+            </w:pPr>
+            <w:r>
+              <w:rPr>
+                <w:rFonts w:ascii="Calibri" w:hAnsi="Calibri"/>
+                <w:color w:val="282C29"/>
+                <w:sz w:val="18"/>
+              </w:rPr>
+              <w:t>120 kWh LiFePO4</w:t>
+            </w:r>
+          </w:p>
+        </w:tc>
+        <w:tc>
+          <w:tcPr>
+            <w:tcW w:type="dxa" w:w="2304"/>
+            <w:shd w:fill="FAF8F5"/>
+            <w:tcMar>
+              <w:top w:w="100" w:type="dxa"/>
+              <w:bottom w:w="100" w:type="dxa"/>
+              <w:left w:w="160" w:type="dxa"/>
+              <w:right w:w="160" w:type="dxa"/>
+            </w:tcMar>
+          </w:tcPr>
+          <w:p>
+            <w:pPr>
+              <w:jc w:val="left"/>
+            </w:pPr>
+            <w:r>
+              <w:rPr>
+                <w:rFonts w:ascii="Calibri" w:hAnsi="Calibri"/>
+                <w:color w:val="282C29"/>
+                <w:sz w:val="18"/>
+              </w:rPr>
+              <w:t>10-year warranty cycle</w:t>
+            </w:r>
+          </w:p>
+        </w:tc>
+        <w:tc>
+          <w:tcPr>
+            <w:tcW w:type="dxa" w:w="3456"/>
+            <w:shd w:fill="FAF8F5"/>
+            <w:tcMar>
+              <w:top w:w="100" w:type="dxa"/>
+              <w:bottom w:w="100" w:type="dxa"/>
+              <w:left w:w="160" w:type="dxa"/>
+              <w:right w:w="160" w:type="dxa"/>
+            </w:tcMar>
+          </w:tcPr>
+          <w:p>
+            <w:pPr>
+              <w:jc w:val="left"/>
+            </w:pPr>
+            <w:r>
+              <w:rPr>
+                <w:rFonts w:ascii="Calibri" w:hAnsi="Calibri"/>
+                <w:color w:val="282C29"/>
+                <w:sz w:val="18"/>
+              </w:rPr>
+              <w:t>48V Victron Energy inverter-charger bank.</w:t>
+            </w:r>
+          </w:p>
+        </w:tc>
+      </w:tr>
+      <w:tr>
+        <w:tc>
+          <w:tcPr>
+            <w:tcW w:type="dxa" w:w="2160"/>
+            <w:shd w:fill="FFFFFF"/>
+            <w:tcMar>
+              <w:top w:w="100" w:type="dxa"/>
+              <w:bottom w:w="100" w:type="dxa"/>
+              <w:left w:w="160" w:type="dxa"/>
+              <w:right w:w="160" w:type="dxa"/>
+            </w:tcMar>
+          </w:tcPr>
+          <w:p>
+            <w:pPr>
+              <w:jc w:val="left"/>
+            </w:pPr>
+            <w:r>
+              <w:rPr>
+                <w:rFonts w:ascii="Calibri" w:hAnsi="Calibri"/>
+                <w:color w:val="282C29"/>
+                <w:sz w:val="18"/>
+              </w:rPr>
+              <w:t>Backup Generation</w:t>
+            </w:r>
+          </w:p>
+        </w:tc>
+        <w:tc>
+          <w:tcPr>
+            <w:tcW w:type="dxa" w:w="2160"/>
+            <w:shd w:fill="FFFFFF"/>
+            <w:tcMar>
+              <w:top w:w="100" w:type="dxa"/>
+              <w:bottom w:w="100" w:type="dxa"/>
+              <w:left w:w="160" w:type="dxa"/>
+              <w:right w:w="160" w:type="dxa"/>
+            </w:tcMar>
+          </w:tcPr>
+          <w:p>
+            <w:pPr>
+              <w:jc w:val="left"/>
+            </w:pPr>
+            <w:r>
+              <w:rPr>
+                <w:rFonts w:ascii="Calibri" w:hAnsi="Calibri"/>
+                <w:color w:val="282C29"/>
+                <w:sz w:val="18"/>
+              </w:rPr>
+              <w:t>30 kVA Silent Diesel</w:t>
+            </w:r>
+          </w:p>
+        </w:tc>
+        <w:tc>
+          <w:tcPr>
+            <w:tcW w:type="dxa" w:w="2304"/>
+            <w:shd w:fill="FFFFFF"/>
+            <w:tcMar>
+              <w:top w:w="100" w:type="dxa"/>
+              <w:bottom w:w="100" w:type="dxa"/>
+              <w:left w:w="160" w:type="dxa"/>
+              <w:right w:w="160" w:type="dxa"/>
+            </w:tcMar>
+          </w:tcPr>
+          <w:p>
+            <w:pPr>
+              <w:jc w:val="left"/>
+            </w:pPr>
+            <w:r>
+              <w:rPr>
+                <w:rFonts w:ascii="Calibri" w:hAnsi="Calibri"/>
+                <w:color w:val="282C29"/>
+                <w:sz w:val="18"/>
+              </w:rPr>
+              <w:t>500-liter day tank</w:t>
+            </w:r>
+          </w:p>
+        </w:tc>
+        <w:tc>
+          <w:tcPr>
+            <w:tcW w:type="dxa" w:w="3456"/>
+            <w:shd w:fill="FFFFFF"/>
+            <w:tcMar>
+              <w:top w:w="100" w:type="dxa"/>
+              <w:bottom w:w="100" w:type="dxa"/>
+              <w:left w:w="160" w:type="dxa"/>
+              <w:right w:w="160" w:type="dxa"/>
+            </w:tcMar>
+          </w:tcPr>
+          <w:p>
+            <w:pPr>
+              <w:jc w:val="left"/>
+            </w:pPr>
+            <w:r>
+              <w:rPr>
+                <w:rFonts w:ascii="Calibri" w:hAnsi="Calibri"/>
+                <w:color w:val="282C29"/>
+                <w:sz w:val="18"/>
+              </w:rPr>
+              <w:t>Automated transfer switch; acoustic enclosure.</w:t>
+            </w:r>
+          </w:p>
+        </w:tc>
+      </w:tr>
+      <w:tr>
+        <w:tc>
+          <w:tcPr>
+            <w:tcW w:type="dxa" w:w="2160"/>
+            <w:shd w:fill="FAF8F5"/>
+            <w:tcMar>
+              <w:top w:w="100" w:type="dxa"/>
+              <w:bottom w:w="100" w:type="dxa"/>
+              <w:left w:w="160" w:type="dxa"/>
+              <w:right w:w="160" w:type="dxa"/>
+            </w:tcMar>
+          </w:tcPr>
+          <w:p>
+            <w:pPr>
+              <w:jc w:val="left"/>
+            </w:pPr>
+            <w:r>
+              <w:rPr>
+                <w:rFonts w:ascii="Calibri" w:hAnsi="Calibri"/>
+                <w:color w:val="282C29"/>
+                <w:sz w:val="18"/>
+              </w:rPr>
+              <w:t>Potable Water Borehole</w:t>
+            </w:r>
+          </w:p>
+        </w:tc>
+        <w:tc>
+          <w:tcPr>
+            <w:tcW w:type="dxa" w:w="2160"/>
+            <w:shd w:fill="FAF8F5"/>
+            <w:tcMar>
+              <w:top w:w="100" w:type="dxa"/>
+              <w:bottom w:w="100" w:type="dxa"/>
+              <w:left w:w="160" w:type="dxa"/>
+              <w:right w:w="160" w:type="dxa"/>
+            </w:tcMar>
+          </w:tcPr>
+          <w:p>
+            <w:pPr>
+              <w:jc w:val="left"/>
+            </w:pPr>
+            <w:r>
+              <w:rPr>
+                <w:rFonts w:ascii="Calibri" w:hAnsi="Calibri"/>
+                <w:color w:val="282C29"/>
+                <w:sz w:val="18"/>
+              </w:rPr>
+              <w:t>10,000 L/hr yield</w:t>
+            </w:r>
+          </w:p>
+        </w:tc>
+        <w:tc>
+          <w:tcPr>
+            <w:tcW w:type="dxa" w:w="2304"/>
+            <w:shd w:fill="FAF8F5"/>
+            <w:tcMar>
+              <w:top w:w="100" w:type="dxa"/>
+              <w:bottom w:w="100" w:type="dxa"/>
+              <w:left w:w="160" w:type="dxa"/>
+              <w:right w:w="160" w:type="dxa"/>
+            </w:tcMar>
+          </w:tcPr>
+          <w:p>
+            <w:pPr>
+              <w:jc w:val="left"/>
+            </w:pPr>
+            <w:r>
+              <w:rPr>
+                <w:rFonts w:ascii="Calibri" w:hAnsi="Calibri"/>
+                <w:color w:val="282C29"/>
+                <w:sz w:val="18"/>
+              </w:rPr>
+              <w:t>150kL raw + 50kL treated</w:t>
+            </w:r>
+          </w:p>
+        </w:tc>
+        <w:tc>
+          <w:tcPr>
+            <w:tcW w:type="dxa" w:w="3456"/>
+            <w:shd w:fill="FAF8F5"/>
+            <w:tcMar>
+              <w:top w:w="100" w:type="dxa"/>
+              <w:bottom w:w="100" w:type="dxa"/>
+              <w:left w:w="160" w:type="dxa"/>
+              <w:right w:w="160" w:type="dxa"/>
+            </w:tcMar>
+          </w:tcPr>
+          <w:p>
+            <w:pPr>
+              <w:jc w:val="left"/>
+            </w:pPr>
+            <w:r>
+              <w:rPr>
+                <w:rFonts w:ascii="Calibri" w:hAnsi="Calibri"/>
+                <w:color w:val="282C29"/>
+                <w:sz w:val="18"/>
+              </w:rPr>
+              <w:t>Deep solar submersible pump; RO &amp; UV purification.</w:t>
+            </w:r>
+          </w:p>
+        </w:tc>
+      </w:tr>
+      <w:tr>
+        <w:tc>
+          <w:tcPr>
+            <w:tcW w:type="dxa" w:w="2160"/>
+            <w:shd w:fill="FFFFFF"/>
+            <w:tcMar>
+              <w:top w:w="100" w:type="dxa"/>
+              <w:bottom w:w="100" w:type="dxa"/>
+              <w:left w:w="160" w:type="dxa"/>
+              <w:right w:w="160" w:type="dxa"/>
+            </w:tcMar>
+          </w:tcPr>
+          <w:p>
+            <w:pPr>
+              <w:jc w:val="left"/>
+            </w:pPr>
+            <w:r>
+              <w:rPr>
+                <w:rFonts w:ascii="Calibri" w:hAnsi="Calibri"/>
+                <w:color w:val="282C29"/>
+                <w:sz w:val="18"/>
+              </w:rPr>
+              <w:t>Greywater Treatment</w:t>
+            </w:r>
+          </w:p>
+        </w:tc>
+        <w:tc>
+          <w:tcPr>
+            <w:tcW w:type="dxa" w:w="2160"/>
+            <w:shd w:fill="FFFFFF"/>
+            <w:tcMar>
+              <w:top w:w="100" w:type="dxa"/>
+              <w:bottom w:w="100" w:type="dxa"/>
+              <w:left w:w="160" w:type="dxa"/>
+              <w:right w:w="160" w:type="dxa"/>
+            </w:tcMar>
+          </w:tcPr>
+          <w:p>
+            <w:pPr>
+              <w:jc w:val="left"/>
+            </w:pPr>
+            <w:r>
+              <w:rPr>
+                <w:rFonts w:ascii="Calibri" w:hAnsi="Calibri"/>
+                <w:color w:val="282C29"/>
+                <w:sz w:val="18"/>
+              </w:rPr>
+              <w:t>15,000 L/day capacity</w:t>
+            </w:r>
+          </w:p>
+        </w:tc>
+        <w:tc>
+          <w:tcPr>
+            <w:tcW w:type="dxa" w:w="2304"/>
+            <w:shd w:fill="FFFFFF"/>
+            <w:tcMar>
+              <w:top w:w="100" w:type="dxa"/>
+              <w:bottom w:w="100" w:type="dxa"/>
+              <w:left w:w="160" w:type="dxa"/>
+              <w:right w:w="160" w:type="dxa"/>
+            </w:tcMar>
+          </w:tcPr>
+          <w:p>
+            <w:pPr>
+              <w:jc w:val="left"/>
+            </w:pPr>
+            <w:r>
+              <w:rPr>
+                <w:rFonts w:ascii="Calibri" w:hAnsi="Calibri"/>
+                <w:color w:val="282C29"/>
+                <w:sz w:val="18"/>
+              </w:rPr>
+              <w:t>Multi-stage reed bed</w:t>
+            </w:r>
+          </w:p>
+        </w:tc>
+        <w:tc>
+          <w:tcPr>
+            <w:tcW w:type="dxa" w:w="3456"/>
+            <w:shd w:fill="FFFFFF"/>
+            <w:tcMar>
+              <w:top w:w="100" w:type="dxa"/>
+              <w:bottom w:w="100" w:type="dxa"/>
+              <w:left w:w="160" w:type="dxa"/>
+              <w:right w:w="160" w:type="dxa"/>
+            </w:tcMar>
+          </w:tcPr>
+          <w:p>
+            <w:pPr>
+              <w:jc w:val="left"/>
+            </w:pPr>
+            <w:r>
+              <w:rPr>
+                <w:rFonts w:ascii="Calibri" w:hAnsi="Calibri"/>
+                <w:color w:val="282C29"/>
+                <w:sz w:val="18"/>
+              </w:rPr>
+              <w:t>Sub-surface drip irrigation for orchards only.</w:t>
+            </w:r>
+          </w:p>
+        </w:tc>
+      </w:tr>
+      <w:tr>
+        <w:tc>
+          <w:tcPr>
+            <w:tcW w:type="dxa" w:w="2160"/>
+            <w:shd w:fill="FAF8F5"/>
+            <w:tcMar>
+              <w:top w:w="100" w:type="dxa"/>
+              <w:bottom w:w="100" w:type="dxa"/>
+              <w:left w:w="160" w:type="dxa"/>
+              <w:right w:w="160" w:type="dxa"/>
+            </w:tcMar>
+          </w:tcPr>
+          <w:p>
+            <w:pPr>
+              <w:jc w:val="left"/>
+            </w:pPr>
+            <w:r>
+              <w:rPr>
+                <w:rFonts w:ascii="Calibri" w:hAnsi="Calibri"/>
+                <w:color w:val="282C29"/>
+                <w:sz w:val="18"/>
+              </w:rPr>
+              <w:t>Fire &amp; Life Safety</w:t>
+            </w:r>
+          </w:p>
+        </w:tc>
+        <w:tc>
+          <w:tcPr>
+            <w:tcW w:type="dxa" w:w="2160"/>
+            <w:shd w:fill="FAF8F5"/>
+            <w:tcMar>
+              <w:top w:w="100" w:type="dxa"/>
+              <w:bottom w:w="100" w:type="dxa"/>
+              <w:left w:w="160" w:type="dxa"/>
+              <w:right w:w="160" w:type="dxa"/>
+            </w:tcMar>
+          </w:tcPr>
+          <w:p>
+            <w:pPr>
+              <w:jc w:val="left"/>
+            </w:pPr>
+            <w:r>
+              <w:rPr>
+                <w:rFonts w:ascii="Calibri" w:hAnsi="Calibri"/>
+                <w:color w:val="282C29"/>
+                <w:sz w:val="18"/>
+              </w:rPr>
+              <w:t>Ring main + 4 hydrants</w:t>
+            </w:r>
+          </w:p>
+        </w:tc>
+        <w:tc>
+          <w:tcPr>
+            <w:tcW w:type="dxa" w:w="2304"/>
+            <w:shd w:fill="FAF8F5"/>
+            <w:tcMar>
+              <w:top w:w="100" w:type="dxa"/>
+              <w:bottom w:w="100" w:type="dxa"/>
+              <w:left w:w="160" w:type="dxa"/>
+              <w:right w:w="160" w:type="dxa"/>
+            </w:tcMar>
+          </w:tcPr>
+          <w:p>
+            <w:pPr>
+              <w:jc w:val="left"/>
+            </w:pPr>
+            <w:r>
+              <w:rPr>
+                <w:rFonts w:ascii="Calibri" w:hAnsi="Calibri"/>
+                <w:color w:val="282C29"/>
+                <w:sz w:val="18"/>
+              </w:rPr>
+              <w:t>30kL dedicated fire reserve</w:t>
+            </w:r>
+          </w:p>
+        </w:tc>
+        <w:tc>
+          <w:tcPr>
+            <w:tcW w:type="dxa" w:w="3456"/>
+            <w:shd w:fill="FAF8F5"/>
+            <w:tcMar>
+              <w:top w:w="100" w:type="dxa"/>
+              <w:bottom w:w="100" w:type="dxa"/>
+              <w:left w:w="160" w:type="dxa"/>
+              <w:right w:w="160" w:type="dxa"/>
+            </w:tcMar>
+          </w:tcPr>
+          <w:p>
+            <w:pPr>
+              <w:jc w:val="left"/>
+            </w:pPr>
+            <w:r>
+              <w:rPr>
+                <w:rFonts w:ascii="Calibri" w:hAnsi="Calibri"/>
+                <w:color w:val="282C29"/>
+                <w:sz w:val="18"/>
+              </w:rPr>
+              <w:t>Diesel backup fire pump; smoke detection.</w:t>
+            </w:r>
+          </w:p>
+        </w:tc>
+      </w:tr>
+    </w:tbl>
+    <w:p>
+      <w:pPr>
+        <w:spacing w:before="80" w:after="160"/>
+      </w:pPr>
+    </w:p>
+    <w:p>
+      <w:pPr>
+        <w:keepNext/>
+        <w:spacing w:before="320" w:after="120"/>
+      </w:pPr>
+      <w:r>
+        <w:rPr>
+          <w:rFonts w:ascii="Georgia" w:hAnsi="Georgia"/>
+          <w:b/>
+          <w:color w:val="19382D"/>
+          <w:sz w:val="28"/>
+        </w:rPr>
+        <w:t>4. Spatial Zoning of Greener Ecosystem &amp; Productive Assets</w:t>
       </w:r>
     </w:p>
     <w:p>
       <w:pPr>
-        <w:pStyle w:val="ListBullet"/>
+        <w:spacing w:before="40" w:after="120" w:line="276" w:lineRule="auto"/>
       </w:pPr>
       <w:r>
-        <w:t>Staff facilities, stores, laundry, plant, waste and maintenance areas.</w:t>
+        <w:rPr>
+          <w:rFonts w:ascii="Calibri" w:hAnsi="Calibri"/>
+          <w:color w:val="282C29"/>
+          <w:sz w:val="20"/>
+        </w:rPr>
+        <w:t>Over 40% of project capex (US$980,000) is allocated to circular utilities, productive agriculture, catering, and retail:</w:t>
+      </w:r>
+    </w:p>
+    <w:tbl>
+      <w:tblPr>
+        <w:tblW w:type="auto" w:w="0"/>
+        <w:jc w:val="center"/>
+        <w:tblLayout w:type="fixed"/>
+        <w:tblLook w:firstColumn="1" w:firstRow="1" w:lastColumn="0" w:lastRow="0" w:noHBand="0" w:noVBand="1" w:val="04A0"/>
+      </w:tblPr>
+      <w:tblGrid>
+        <w:gridCol w:w="1958"/>
+        <w:gridCol w:w="1958"/>
+        <w:gridCol w:w="1958"/>
+        <w:gridCol w:w="1958"/>
+        <w:gridCol w:w="1958"/>
+      </w:tblGrid>
+      <w:tr>
+        <w:tc>
+          <w:tcPr>
+            <w:tcW w:type="dxa" w:w="2592"/>
+            <w:shd w:fill="19382D"/>
+            <w:tcMar>
+              <w:top w:w="140" w:type="dxa"/>
+              <w:bottom w:w="140" w:type="dxa"/>
+              <w:left w:w="180" w:type="dxa"/>
+              <w:right w:w="180" w:type="dxa"/>
+            </w:tcMar>
+          </w:tcPr>
+          <w:p>
+            <w:pPr>
+              <w:jc w:val="left"/>
+            </w:pPr>
+            <w:r>
+              <w:rPr>
+                <w:rFonts w:ascii="Calibri" w:hAnsi="Calibri"/>
+                <w:b/>
+                <w:color w:val="F7F4EC"/>
+                <w:sz w:val="19"/>
+              </w:rPr>
+              <w:t>Asset Category</w:t>
+            </w:r>
+          </w:p>
+        </w:tc>
+        <w:tc>
+          <w:tcPr>
+            <w:tcW w:type="dxa" w:w="1440"/>
+            <w:shd w:fill="19382D"/>
+            <w:tcMar>
+              <w:top w:w="140" w:type="dxa"/>
+              <w:bottom w:w="140" w:type="dxa"/>
+              <w:left w:w="180" w:type="dxa"/>
+              <w:right w:w="180" w:type="dxa"/>
+            </w:tcMar>
+          </w:tcPr>
+          <w:p>
+            <w:pPr>
+              <w:jc w:val="left"/>
+            </w:pPr>
+            <w:r>
+              <w:rPr>
+                <w:rFonts w:ascii="Calibri" w:hAnsi="Calibri"/>
+                <w:b/>
+                <w:color w:val="F7F4EC"/>
+                <w:sz w:val="19"/>
+              </w:rPr>
+              <w:t>Spatial Zone</w:t>
+            </w:r>
+          </w:p>
+        </w:tc>
+        <w:tc>
+          <w:tcPr>
+            <w:tcW w:type="dxa" w:w="1440"/>
+            <w:shd w:fill="19382D"/>
+            <w:tcMar>
+              <w:top w:w="140" w:type="dxa"/>
+              <w:bottom w:w="140" w:type="dxa"/>
+              <w:left w:w="180" w:type="dxa"/>
+              <w:right w:w="180" w:type="dxa"/>
+            </w:tcMar>
+          </w:tcPr>
+          <w:p>
+            <w:pPr>
+              <w:jc w:val="left"/>
+            </w:pPr>
+            <w:r>
+              <w:rPr>
+                <w:rFonts w:ascii="Calibri" w:hAnsi="Calibri"/>
+                <w:b/>
+                <w:color w:val="F7F4EC"/>
+                <w:sz w:val="19"/>
+              </w:rPr>
+              <w:t>Budget (US$)</w:t>
+            </w:r>
+          </w:p>
+        </w:tc>
+        <w:tc>
+          <w:tcPr>
+            <w:tcW w:type="dxa" w:w="1152"/>
+            <w:shd w:fill="19382D"/>
+            <w:tcMar>
+              <w:top w:w="140" w:type="dxa"/>
+              <w:bottom w:w="140" w:type="dxa"/>
+              <w:left w:w="180" w:type="dxa"/>
+              <w:right w:w="180" w:type="dxa"/>
+            </w:tcMar>
+          </w:tcPr>
+          <w:p>
+            <w:pPr>
+              <w:jc w:val="left"/>
+            </w:pPr>
+            <w:r>
+              <w:rPr>
+                <w:rFonts w:ascii="Calibri" w:hAnsi="Calibri"/>
+                <w:b/>
+                <w:color w:val="F7F4EC"/>
+                <w:sz w:val="19"/>
+              </w:rPr>
+              <w:t>Share (%)</w:t>
+            </w:r>
+          </w:p>
+        </w:tc>
+        <w:tc>
+          <w:tcPr>
+            <w:tcW w:type="dxa" w:w="3456"/>
+            <w:shd w:fill="19382D"/>
+            <w:tcMar>
+              <w:top w:w="140" w:type="dxa"/>
+              <w:bottom w:w="140" w:type="dxa"/>
+              <w:left w:w="180" w:type="dxa"/>
+              <w:right w:w="180" w:type="dxa"/>
+            </w:tcMar>
+          </w:tcPr>
+          <w:p>
+            <w:pPr>
+              <w:jc w:val="left"/>
+            </w:pPr>
+            <w:r>
+              <w:rPr>
+                <w:rFonts w:ascii="Calibri" w:hAnsi="Calibri"/>
+                <w:b/>
+                <w:color w:val="F7F4EC"/>
+                <w:sz w:val="19"/>
+              </w:rPr>
+              <w:t>Design &amp; Operational Role</w:t>
+            </w:r>
+          </w:p>
+        </w:tc>
+      </w:tr>
+      <w:tr>
+        <w:tc>
+          <w:tcPr>
+            <w:tcW w:type="dxa" w:w="2592"/>
+            <w:shd w:fill="FFFFFF"/>
+            <w:tcMar>
+              <w:top w:w="100" w:type="dxa"/>
+              <w:bottom w:w="100" w:type="dxa"/>
+              <w:left w:w="160" w:type="dxa"/>
+              <w:right w:w="160" w:type="dxa"/>
+            </w:tcMar>
+          </w:tcPr>
+          <w:p>
+            <w:pPr>
+              <w:jc w:val="left"/>
+            </w:pPr>
+            <w:r>
+              <w:rPr>
+                <w:rFonts w:ascii="Calibri" w:hAnsi="Calibri"/>
+                <w:color w:val="282C29"/>
+                <w:sz w:val="18"/>
+              </w:rPr>
+              <w:t>Solar-Hybrid Microgrid</w:t>
+            </w:r>
+          </w:p>
+        </w:tc>
+        <w:tc>
+          <w:tcPr>
+            <w:tcW w:type="dxa" w:w="1440"/>
+            <w:shd w:fill="FFFFFF"/>
+            <w:tcMar>
+              <w:top w:w="100" w:type="dxa"/>
+              <w:bottom w:w="100" w:type="dxa"/>
+              <w:left w:w="160" w:type="dxa"/>
+              <w:right w:w="160" w:type="dxa"/>
+            </w:tcMar>
+          </w:tcPr>
+          <w:p>
+            <w:pPr>
+              <w:jc w:val="left"/>
+            </w:pPr>
+            <w:r>
+              <w:rPr>
+                <w:rFonts w:ascii="Calibri" w:hAnsi="Calibri"/>
+                <w:color w:val="282C29"/>
+                <w:sz w:val="18"/>
+              </w:rPr>
+              <w:t>0.40 ha</w:t>
+            </w:r>
+          </w:p>
+        </w:tc>
+        <w:tc>
+          <w:tcPr>
+            <w:tcW w:type="dxa" w:w="1440"/>
+            <w:shd w:fill="FFFFFF"/>
+            <w:tcMar>
+              <w:top w:w="100" w:type="dxa"/>
+              <w:bottom w:w="100" w:type="dxa"/>
+              <w:left w:w="160" w:type="dxa"/>
+              <w:right w:w="160" w:type="dxa"/>
+            </w:tcMar>
+          </w:tcPr>
+          <w:p>
+            <w:pPr>
+              <w:jc w:val="left"/>
+            </w:pPr>
+            <w:r>
+              <w:rPr>
+                <w:rFonts w:ascii="Calibri" w:hAnsi="Calibri"/>
+                <w:color w:val="282C29"/>
+                <w:sz w:val="18"/>
+              </w:rPr>
+              <w:t>$160,000</w:t>
+            </w:r>
+          </w:p>
+        </w:tc>
+        <w:tc>
+          <w:tcPr>
+            <w:tcW w:type="dxa" w:w="1152"/>
+            <w:shd w:fill="FFFFFF"/>
+            <w:tcMar>
+              <w:top w:w="100" w:type="dxa"/>
+              <w:bottom w:w="100" w:type="dxa"/>
+              <w:left w:w="160" w:type="dxa"/>
+              <w:right w:w="160" w:type="dxa"/>
+            </w:tcMar>
+          </w:tcPr>
+          <w:p>
+            <w:pPr>
+              <w:jc w:val="left"/>
+            </w:pPr>
+            <w:r>
+              <w:rPr>
+                <w:rFonts w:ascii="Calibri" w:hAnsi="Calibri"/>
+                <w:color w:val="282C29"/>
+                <w:sz w:val="18"/>
+              </w:rPr>
+              <w:t>6.7%</w:t>
+            </w:r>
+          </w:p>
+        </w:tc>
+        <w:tc>
+          <w:tcPr>
+            <w:tcW w:type="dxa" w:w="3456"/>
+            <w:shd w:fill="FFFFFF"/>
+            <w:tcMar>
+              <w:top w:w="100" w:type="dxa"/>
+              <w:bottom w:w="100" w:type="dxa"/>
+              <w:left w:w="160" w:type="dxa"/>
+              <w:right w:w="160" w:type="dxa"/>
+            </w:tcMar>
+          </w:tcPr>
+          <w:p>
+            <w:pPr>
+              <w:jc w:val="left"/>
+            </w:pPr>
+            <w:r>
+              <w:rPr>
+                <w:rFonts w:ascii="Calibri" w:hAnsi="Calibri"/>
+                <w:color w:val="282C29"/>
+                <w:sz w:val="18"/>
+              </w:rPr>
+              <w:t>60 kWp solar PV array, 120 kWh LiFePO4 batteries, smart cluster inverters.</w:t>
+            </w:r>
+          </w:p>
+        </w:tc>
+      </w:tr>
+      <w:tr>
+        <w:tc>
+          <w:tcPr>
+            <w:tcW w:type="dxa" w:w="2592"/>
+            <w:shd w:fill="FAF8F5"/>
+            <w:tcMar>
+              <w:top w:w="100" w:type="dxa"/>
+              <w:bottom w:w="100" w:type="dxa"/>
+              <w:left w:w="160" w:type="dxa"/>
+              <w:right w:w="160" w:type="dxa"/>
+            </w:tcMar>
+          </w:tcPr>
+          <w:p>
+            <w:pPr>
+              <w:jc w:val="left"/>
+            </w:pPr>
+            <w:r>
+              <w:rPr>
+                <w:rFonts w:ascii="Calibri" w:hAnsi="Calibri"/>
+                <w:color w:val="282C29"/>
+                <w:sz w:val="18"/>
+              </w:rPr>
+              <w:t>Circular Biogas Digester</w:t>
+            </w:r>
+          </w:p>
+        </w:tc>
+        <w:tc>
+          <w:tcPr>
+            <w:tcW w:type="dxa" w:w="1440"/>
+            <w:shd w:fill="FAF8F5"/>
+            <w:tcMar>
+              <w:top w:w="100" w:type="dxa"/>
+              <w:bottom w:w="100" w:type="dxa"/>
+              <w:left w:w="160" w:type="dxa"/>
+              <w:right w:w="160" w:type="dxa"/>
+            </w:tcMar>
+          </w:tcPr>
+          <w:p>
+            <w:pPr>
+              <w:jc w:val="left"/>
+            </w:pPr>
+            <w:r>
+              <w:rPr>
+                <w:rFonts w:ascii="Calibri" w:hAnsi="Calibri"/>
+                <w:color w:val="282C29"/>
+                <w:sz w:val="18"/>
+              </w:rPr>
+              <w:t>0.30 ha</w:t>
+            </w:r>
+          </w:p>
+        </w:tc>
+        <w:tc>
+          <w:tcPr>
+            <w:tcW w:type="dxa" w:w="1440"/>
+            <w:shd w:fill="FAF8F5"/>
+            <w:tcMar>
+              <w:top w:w="100" w:type="dxa"/>
+              <w:bottom w:w="100" w:type="dxa"/>
+              <w:left w:w="160" w:type="dxa"/>
+              <w:right w:w="160" w:type="dxa"/>
+            </w:tcMar>
+          </w:tcPr>
+          <w:p>
+            <w:pPr>
+              <w:jc w:val="left"/>
+            </w:pPr>
+            <w:r>
+              <w:rPr>
+                <w:rFonts w:ascii="Calibri" w:hAnsi="Calibri"/>
+                <w:color w:val="282C29"/>
+                <w:sz w:val="18"/>
+              </w:rPr>
+              <w:t>$80,000</w:t>
+            </w:r>
+          </w:p>
+        </w:tc>
+        <w:tc>
+          <w:tcPr>
+            <w:tcW w:type="dxa" w:w="1152"/>
+            <w:shd w:fill="FAF8F5"/>
+            <w:tcMar>
+              <w:top w:w="100" w:type="dxa"/>
+              <w:bottom w:w="100" w:type="dxa"/>
+              <w:left w:w="160" w:type="dxa"/>
+              <w:right w:w="160" w:type="dxa"/>
+            </w:tcMar>
+          </w:tcPr>
+          <w:p>
+            <w:pPr>
+              <w:jc w:val="left"/>
+            </w:pPr>
+            <w:r>
+              <w:rPr>
+                <w:rFonts w:ascii="Calibri" w:hAnsi="Calibri"/>
+                <w:color w:val="282C29"/>
+                <w:sz w:val="18"/>
+              </w:rPr>
+              <w:t>3.3%</w:t>
+            </w:r>
+          </w:p>
+        </w:tc>
+        <w:tc>
+          <w:tcPr>
+            <w:tcW w:type="dxa" w:w="3456"/>
+            <w:shd w:fill="FAF8F5"/>
+            <w:tcMar>
+              <w:top w:w="100" w:type="dxa"/>
+              <w:bottom w:w="100" w:type="dxa"/>
+              <w:left w:w="160" w:type="dxa"/>
+              <w:right w:w="160" w:type="dxa"/>
+            </w:tcMar>
+          </w:tcPr>
+          <w:p>
+            <w:pPr>
+              <w:jc w:val="left"/>
+            </w:pPr>
+            <w:r>
+              <w:rPr>
+                <w:rFonts w:ascii="Calibri" w:hAnsi="Calibri"/>
+                <w:color w:val="282C29"/>
+                <w:sz w:val="18"/>
+              </w:rPr>
+              <w:t>Anaerobic biodigester converting manure &amp; kitchen waste into cooking gas &amp; bio-slurry.</w:t>
+            </w:r>
+          </w:p>
+        </w:tc>
+      </w:tr>
+      <w:tr>
+        <w:tc>
+          <w:tcPr>
+            <w:tcW w:type="dxa" w:w="2592"/>
+            <w:shd w:fill="FFFFFF"/>
+            <w:tcMar>
+              <w:top w:w="100" w:type="dxa"/>
+              <w:bottom w:w="100" w:type="dxa"/>
+              <w:left w:w="160" w:type="dxa"/>
+              <w:right w:w="160" w:type="dxa"/>
+            </w:tcMar>
+          </w:tcPr>
+          <w:p>
+            <w:pPr>
+              <w:jc w:val="left"/>
+            </w:pPr>
+            <w:r>
+              <w:rPr>
+                <w:rFonts w:ascii="Calibri" w:hAnsi="Calibri"/>
+                <w:color w:val="282C29"/>
+                <w:sz w:val="18"/>
+              </w:rPr>
+              <w:t>Hydrology &amp; Precision Drip</w:t>
+            </w:r>
+          </w:p>
+        </w:tc>
+        <w:tc>
+          <w:tcPr>
+            <w:tcW w:type="dxa" w:w="1440"/>
+            <w:shd w:fill="FFFFFF"/>
+            <w:tcMar>
+              <w:top w:w="100" w:type="dxa"/>
+              <w:bottom w:w="100" w:type="dxa"/>
+              <w:left w:w="160" w:type="dxa"/>
+              <w:right w:w="160" w:type="dxa"/>
+            </w:tcMar>
+          </w:tcPr>
+          <w:p>
+            <w:pPr>
+              <w:jc w:val="left"/>
+            </w:pPr>
+            <w:r>
+              <w:rPr>
+                <w:rFonts w:ascii="Calibri" w:hAnsi="Calibri"/>
+                <w:color w:val="282C29"/>
+                <w:sz w:val="18"/>
+              </w:rPr>
+              <w:t>5.30 ha</w:t>
+            </w:r>
+          </w:p>
+        </w:tc>
+        <w:tc>
+          <w:tcPr>
+            <w:tcW w:type="dxa" w:w="1440"/>
+            <w:shd w:fill="FFFFFF"/>
+            <w:tcMar>
+              <w:top w:w="100" w:type="dxa"/>
+              <w:bottom w:w="100" w:type="dxa"/>
+              <w:left w:w="160" w:type="dxa"/>
+              <w:right w:w="160" w:type="dxa"/>
+            </w:tcMar>
+          </w:tcPr>
+          <w:p>
+            <w:pPr>
+              <w:jc w:val="left"/>
+            </w:pPr>
+            <w:r>
+              <w:rPr>
+                <w:rFonts w:ascii="Calibri" w:hAnsi="Calibri"/>
+                <w:color w:val="282C29"/>
+                <w:sz w:val="18"/>
+              </w:rPr>
+              <w:t>$240,000</w:t>
+            </w:r>
+          </w:p>
+        </w:tc>
+        <w:tc>
+          <w:tcPr>
+            <w:tcW w:type="dxa" w:w="1152"/>
+            <w:shd w:fill="FFFFFF"/>
+            <w:tcMar>
+              <w:top w:w="100" w:type="dxa"/>
+              <w:bottom w:w="100" w:type="dxa"/>
+              <w:left w:w="160" w:type="dxa"/>
+              <w:right w:w="160" w:type="dxa"/>
+            </w:tcMar>
+          </w:tcPr>
+          <w:p>
+            <w:pPr>
+              <w:jc w:val="left"/>
+            </w:pPr>
+            <w:r>
+              <w:rPr>
+                <w:rFonts w:ascii="Calibri" w:hAnsi="Calibri"/>
+                <w:color w:val="282C29"/>
+                <w:sz w:val="18"/>
+              </w:rPr>
+              <w:t>10.0%</w:t>
+            </w:r>
+          </w:p>
+        </w:tc>
+        <w:tc>
+          <w:tcPr>
+            <w:tcW w:type="dxa" w:w="3456"/>
+            <w:shd w:fill="FFFFFF"/>
+            <w:tcMar>
+              <w:top w:w="100" w:type="dxa"/>
+              <w:bottom w:w="100" w:type="dxa"/>
+              <w:left w:w="160" w:type="dxa"/>
+              <w:right w:w="160" w:type="dxa"/>
+            </w:tcMar>
+          </w:tcPr>
+          <w:p>
+            <w:pPr>
+              <w:jc w:val="left"/>
+            </w:pPr>
+            <w:r>
+              <w:rPr>
+                <w:rFonts w:ascii="Calibri" w:hAnsi="Calibri"/>
+                <w:color w:val="282C29"/>
+                <w:sz w:val="18"/>
+              </w:rPr>
+              <w:t>10k L/hr solar borehole, 200kL storage, automated drip across 5.3 ha, greywater wetlands.</w:t>
+            </w:r>
+          </w:p>
+        </w:tc>
+      </w:tr>
+      <w:tr>
+        <w:tc>
+          <w:tcPr>
+            <w:tcW w:type="dxa" w:w="2592"/>
+            <w:shd w:fill="FAF8F5"/>
+            <w:tcMar>
+              <w:top w:w="100" w:type="dxa"/>
+              <w:bottom w:w="100" w:type="dxa"/>
+              <w:left w:w="160" w:type="dxa"/>
+              <w:right w:w="160" w:type="dxa"/>
+            </w:tcMar>
+          </w:tcPr>
+          <w:p>
+            <w:pPr>
+              <w:jc w:val="left"/>
+            </w:pPr>
+            <w:r>
+              <w:rPr>
+                <w:rFonts w:ascii="Calibri" w:hAnsi="Calibri"/>
+                <w:color w:val="282C29"/>
+                <w:sz w:val="18"/>
+              </w:rPr>
+              <w:t>Farmland Landscaping &amp; Swales</w:t>
+            </w:r>
+          </w:p>
+        </w:tc>
+        <w:tc>
+          <w:tcPr>
+            <w:tcW w:type="dxa" w:w="1440"/>
+            <w:shd w:fill="FAF8F5"/>
+            <w:tcMar>
+              <w:top w:w="100" w:type="dxa"/>
+              <w:bottom w:w="100" w:type="dxa"/>
+              <w:left w:w="160" w:type="dxa"/>
+              <w:right w:w="160" w:type="dxa"/>
+            </w:tcMar>
+          </w:tcPr>
+          <w:p>
+            <w:pPr>
+              <w:jc w:val="left"/>
+            </w:pPr>
+            <w:r>
+              <w:rPr>
+                <w:rFonts w:ascii="Calibri" w:hAnsi="Calibri"/>
+                <w:color w:val="282C29"/>
+                <w:sz w:val="18"/>
+              </w:rPr>
+              <w:t>2.50 ha</w:t>
+            </w:r>
+          </w:p>
+        </w:tc>
+        <w:tc>
+          <w:tcPr>
+            <w:tcW w:type="dxa" w:w="1440"/>
+            <w:shd w:fill="FAF8F5"/>
+            <w:tcMar>
+              <w:top w:w="100" w:type="dxa"/>
+              <w:bottom w:w="100" w:type="dxa"/>
+              <w:left w:w="160" w:type="dxa"/>
+              <w:right w:w="160" w:type="dxa"/>
+            </w:tcMar>
+          </w:tcPr>
+          <w:p>
+            <w:pPr>
+              <w:jc w:val="left"/>
+            </w:pPr>
+            <w:r>
+              <w:rPr>
+                <w:rFonts w:ascii="Calibri" w:hAnsi="Calibri"/>
+                <w:color w:val="282C29"/>
+                <w:sz w:val="18"/>
+              </w:rPr>
+              <w:t>$120,000</w:t>
+            </w:r>
+          </w:p>
+        </w:tc>
+        <w:tc>
+          <w:tcPr>
+            <w:tcW w:type="dxa" w:w="1152"/>
+            <w:shd w:fill="FAF8F5"/>
+            <w:tcMar>
+              <w:top w:w="100" w:type="dxa"/>
+              <w:bottom w:w="100" w:type="dxa"/>
+              <w:left w:w="160" w:type="dxa"/>
+              <w:right w:w="160" w:type="dxa"/>
+            </w:tcMar>
+          </w:tcPr>
+          <w:p>
+            <w:pPr>
+              <w:jc w:val="left"/>
+            </w:pPr>
+            <w:r>
+              <w:rPr>
+                <w:rFonts w:ascii="Calibri" w:hAnsi="Calibri"/>
+                <w:color w:val="282C29"/>
+                <w:sz w:val="18"/>
+              </w:rPr>
+              <w:t>5.0%</w:t>
+            </w:r>
+          </w:p>
+        </w:tc>
+        <w:tc>
+          <w:tcPr>
+            <w:tcW w:type="dxa" w:w="3456"/>
+            <w:shd w:fill="FAF8F5"/>
+            <w:tcMar>
+              <w:top w:w="100" w:type="dxa"/>
+              <w:bottom w:w="100" w:type="dxa"/>
+              <w:left w:w="160" w:type="dxa"/>
+              <w:right w:w="160" w:type="dxa"/>
+            </w:tcMar>
+          </w:tcPr>
+          <w:p>
+            <w:pPr>
+              <w:jc w:val="left"/>
+            </w:pPr>
+            <w:r>
+              <w:rPr>
+                <w:rFonts w:ascii="Calibri" w:hAnsi="Calibri"/>
+                <w:color w:val="282C29"/>
+                <w:sz w:val="18"/>
+              </w:rPr>
+              <w:t>Keyline swales for moisture retention, acacia windbreaks, citrus &amp; avocado orchards.</w:t>
+            </w:r>
+          </w:p>
+        </w:tc>
+      </w:tr>
+      <w:tr>
+        <w:tc>
+          <w:tcPr>
+            <w:tcW w:type="dxa" w:w="2592"/>
+            <w:shd w:fill="FFFFFF"/>
+            <w:tcMar>
+              <w:top w:w="100" w:type="dxa"/>
+              <w:bottom w:w="100" w:type="dxa"/>
+              <w:left w:w="160" w:type="dxa"/>
+              <w:right w:w="160" w:type="dxa"/>
+            </w:tcMar>
+          </w:tcPr>
+          <w:p>
+            <w:pPr>
+              <w:jc w:val="left"/>
+            </w:pPr>
+            <w:r>
+              <w:rPr>
+                <w:rFonts w:ascii="Calibri" w:hAnsi="Calibri"/>
+                <w:color w:val="282C29"/>
+                <w:sz w:val="18"/>
+              </w:rPr>
+              <w:t>Animal Structures &amp; Apiary</w:t>
+            </w:r>
+          </w:p>
+        </w:tc>
+        <w:tc>
+          <w:tcPr>
+            <w:tcW w:type="dxa" w:w="1440"/>
+            <w:shd w:fill="FFFFFF"/>
+            <w:tcMar>
+              <w:top w:w="100" w:type="dxa"/>
+              <w:bottom w:w="100" w:type="dxa"/>
+              <w:left w:w="160" w:type="dxa"/>
+              <w:right w:w="160" w:type="dxa"/>
+            </w:tcMar>
+          </w:tcPr>
+          <w:p>
+            <w:pPr>
+              <w:jc w:val="left"/>
+            </w:pPr>
+            <w:r>
+              <w:rPr>
+                <w:rFonts w:ascii="Calibri" w:hAnsi="Calibri"/>
+                <w:color w:val="282C29"/>
+                <w:sz w:val="18"/>
+              </w:rPr>
+              <w:t>1.80 ha</w:t>
+            </w:r>
+          </w:p>
+        </w:tc>
+        <w:tc>
+          <w:tcPr>
+            <w:tcW w:type="dxa" w:w="1440"/>
+            <w:shd w:fill="FFFFFF"/>
+            <w:tcMar>
+              <w:top w:w="100" w:type="dxa"/>
+              <w:bottom w:w="100" w:type="dxa"/>
+              <w:left w:w="160" w:type="dxa"/>
+              <w:right w:w="160" w:type="dxa"/>
+            </w:tcMar>
+          </w:tcPr>
+          <w:p>
+            <w:pPr>
+              <w:jc w:val="left"/>
+            </w:pPr>
+            <w:r>
+              <w:rPr>
+                <w:rFonts w:ascii="Calibri" w:hAnsi="Calibri"/>
+                <w:color w:val="282C29"/>
+                <w:sz w:val="18"/>
+              </w:rPr>
+              <w:t>$80,000</w:t>
+            </w:r>
+          </w:p>
+        </w:tc>
+        <w:tc>
+          <w:tcPr>
+            <w:tcW w:type="dxa" w:w="1152"/>
+            <w:shd w:fill="FFFFFF"/>
+            <w:tcMar>
+              <w:top w:w="100" w:type="dxa"/>
+              <w:bottom w:w="100" w:type="dxa"/>
+              <w:left w:w="160" w:type="dxa"/>
+              <w:right w:w="160" w:type="dxa"/>
+            </w:tcMar>
+          </w:tcPr>
+          <w:p>
+            <w:pPr>
+              <w:jc w:val="left"/>
+            </w:pPr>
+            <w:r>
+              <w:rPr>
+                <w:rFonts w:ascii="Calibri" w:hAnsi="Calibri"/>
+                <w:color w:val="282C29"/>
+                <w:sz w:val="18"/>
+              </w:rPr>
+              <w:t>3.3%</w:t>
+            </w:r>
+          </w:p>
+        </w:tc>
+        <w:tc>
+          <w:tcPr>
+            <w:tcW w:type="dxa" w:w="3456"/>
+            <w:shd w:fill="FFFFFF"/>
+            <w:tcMar>
+              <w:top w:w="100" w:type="dxa"/>
+              <w:bottom w:w="100" w:type="dxa"/>
+              <w:left w:w="160" w:type="dxa"/>
+              <w:right w:w="160" w:type="dxa"/>
+            </w:tcMar>
+          </w:tcPr>
+          <w:p>
+            <w:pPr>
+              <w:jc w:val="left"/>
+            </w:pPr>
+            <w:r>
+              <w:rPr>
+                <w:rFonts w:ascii="Calibri" w:hAnsi="Calibri"/>
+                <w:color w:val="282C29"/>
+                <w:sz w:val="18"/>
+              </w:rPr>
+              <w:t>Rotational sheep paddocks, poultry houses, dairy milking station, 40+ Langstroth hives.</w:t>
+            </w:r>
+          </w:p>
+        </w:tc>
+      </w:tr>
+      <w:tr>
+        <w:tc>
+          <w:tcPr>
+            <w:tcW w:type="dxa" w:w="2592"/>
+            <w:shd w:fill="FAF8F5"/>
+            <w:tcMar>
+              <w:top w:w="100" w:type="dxa"/>
+              <w:bottom w:w="100" w:type="dxa"/>
+              <w:left w:w="160" w:type="dxa"/>
+              <w:right w:w="160" w:type="dxa"/>
+            </w:tcMar>
+          </w:tcPr>
+          <w:p>
+            <w:pPr>
+              <w:jc w:val="left"/>
+            </w:pPr>
+            <w:r>
+              <w:rPr>
+                <w:rFonts w:ascii="Calibri" w:hAnsi="Calibri"/>
+                <w:color w:val="282C29"/>
+                <w:sz w:val="18"/>
+              </w:rPr>
+              <w:t>Farm Machinery &amp; Clean Fleet</w:t>
+            </w:r>
+          </w:p>
+        </w:tc>
+        <w:tc>
+          <w:tcPr>
+            <w:tcW w:type="dxa" w:w="1440"/>
+            <w:shd w:fill="FAF8F5"/>
+            <w:tcMar>
+              <w:top w:w="100" w:type="dxa"/>
+              <w:bottom w:w="100" w:type="dxa"/>
+              <w:left w:w="160" w:type="dxa"/>
+              <w:right w:w="160" w:type="dxa"/>
+            </w:tcMar>
+          </w:tcPr>
+          <w:p>
+            <w:pPr>
+              <w:jc w:val="left"/>
+            </w:pPr>
+            <w:r>
+              <w:rPr>
+                <w:rFonts w:ascii="Calibri" w:hAnsi="Calibri"/>
+                <w:color w:val="282C29"/>
+                <w:sz w:val="18"/>
+              </w:rPr>
+              <w:t>0.20 ha</w:t>
+            </w:r>
+          </w:p>
+        </w:tc>
+        <w:tc>
+          <w:tcPr>
+            <w:tcW w:type="dxa" w:w="1440"/>
+            <w:shd w:fill="FAF8F5"/>
+            <w:tcMar>
+              <w:top w:w="100" w:type="dxa"/>
+              <w:bottom w:w="100" w:type="dxa"/>
+              <w:left w:w="160" w:type="dxa"/>
+              <w:right w:w="160" w:type="dxa"/>
+            </w:tcMar>
+          </w:tcPr>
+          <w:p>
+            <w:pPr>
+              <w:jc w:val="left"/>
+            </w:pPr>
+            <w:r>
+              <w:rPr>
+                <w:rFonts w:ascii="Calibri" w:hAnsi="Calibri"/>
+                <w:color w:val="282C29"/>
+                <w:sz w:val="18"/>
+              </w:rPr>
+              <w:t>$60,000</w:t>
+            </w:r>
+          </w:p>
+        </w:tc>
+        <w:tc>
+          <w:tcPr>
+            <w:tcW w:type="dxa" w:w="1152"/>
+            <w:shd w:fill="FAF8F5"/>
+            <w:tcMar>
+              <w:top w:w="100" w:type="dxa"/>
+              <w:bottom w:w="100" w:type="dxa"/>
+              <w:left w:w="160" w:type="dxa"/>
+              <w:right w:w="160" w:type="dxa"/>
+            </w:tcMar>
+          </w:tcPr>
+          <w:p>
+            <w:pPr>
+              <w:jc w:val="left"/>
+            </w:pPr>
+            <w:r>
+              <w:rPr>
+                <w:rFonts w:ascii="Calibri" w:hAnsi="Calibri"/>
+                <w:color w:val="282C29"/>
+                <w:sz w:val="18"/>
+              </w:rPr>
+              <w:t>2.5%</w:t>
+            </w:r>
+          </w:p>
+        </w:tc>
+        <w:tc>
+          <w:tcPr>
+            <w:tcW w:type="dxa" w:w="3456"/>
+            <w:shd w:fill="FAF8F5"/>
+            <w:tcMar>
+              <w:top w:w="100" w:type="dxa"/>
+              <w:bottom w:w="100" w:type="dxa"/>
+              <w:left w:w="160" w:type="dxa"/>
+              <w:right w:w="160" w:type="dxa"/>
+            </w:tcMar>
+          </w:tcPr>
+          <w:p>
+            <w:pPr>
+              <w:jc w:val="left"/>
+            </w:pPr>
+            <w:r>
+              <w:rPr>
+                <w:rFonts w:ascii="Calibri" w:hAnsi="Calibri"/>
+                <w:color w:val="282C29"/>
+                <w:sz w:val="18"/>
+              </w:rPr>
+              <w:t>Depot, compact tractors, compost spreaders, solar charging, electric utility buggies.</w:t>
+            </w:r>
+          </w:p>
+        </w:tc>
+      </w:tr>
+      <w:tr>
+        <w:tc>
+          <w:tcPr>
+            <w:tcW w:type="dxa" w:w="2592"/>
+            <w:shd w:fill="FFFFFF"/>
+            <w:tcMar>
+              <w:top w:w="100" w:type="dxa"/>
+              <w:bottom w:w="100" w:type="dxa"/>
+              <w:left w:w="160" w:type="dxa"/>
+              <w:right w:w="160" w:type="dxa"/>
+            </w:tcMar>
+          </w:tcPr>
+          <w:p>
+            <w:pPr>
+              <w:jc w:val="left"/>
+            </w:pPr>
+            <w:r>
+              <w:rPr>
+                <w:rFonts w:ascii="Calibri" w:hAnsi="Calibri"/>
+                <w:color w:val="282C29"/>
+                <w:sz w:val="18"/>
+              </w:rPr>
+              <w:t>Catering Kitchen &amp; Bakery</w:t>
+            </w:r>
+          </w:p>
+        </w:tc>
+        <w:tc>
+          <w:tcPr>
+            <w:tcW w:type="dxa" w:w="1440"/>
+            <w:shd w:fill="FFFFFF"/>
+            <w:tcMar>
+              <w:top w:w="100" w:type="dxa"/>
+              <w:bottom w:w="100" w:type="dxa"/>
+              <w:left w:w="160" w:type="dxa"/>
+              <w:right w:w="160" w:type="dxa"/>
+            </w:tcMar>
+          </w:tcPr>
+          <w:p>
+            <w:pPr>
+              <w:jc w:val="left"/>
+            </w:pPr>
+            <w:r>
+              <w:rPr>
+                <w:rFonts w:ascii="Calibri" w:hAnsi="Calibri"/>
+                <w:color w:val="282C29"/>
+                <w:sz w:val="18"/>
+              </w:rPr>
+              <w:t>0.40 ha</w:t>
+            </w:r>
+          </w:p>
+        </w:tc>
+        <w:tc>
+          <w:tcPr>
+            <w:tcW w:type="dxa" w:w="1440"/>
+            <w:shd w:fill="FFFFFF"/>
+            <w:tcMar>
+              <w:top w:w="100" w:type="dxa"/>
+              <w:bottom w:w="100" w:type="dxa"/>
+              <w:left w:w="160" w:type="dxa"/>
+              <w:right w:w="160" w:type="dxa"/>
+            </w:tcMar>
+          </w:tcPr>
+          <w:p>
+            <w:pPr>
+              <w:jc w:val="left"/>
+            </w:pPr>
+            <w:r>
+              <w:rPr>
+                <w:rFonts w:ascii="Calibri" w:hAnsi="Calibri"/>
+                <w:color w:val="282C29"/>
+                <w:sz w:val="18"/>
+              </w:rPr>
+              <w:t>$160,000</w:t>
+            </w:r>
+          </w:p>
+        </w:tc>
+        <w:tc>
+          <w:tcPr>
+            <w:tcW w:type="dxa" w:w="1152"/>
+            <w:shd w:fill="FFFFFF"/>
+            <w:tcMar>
+              <w:top w:w="100" w:type="dxa"/>
+              <w:bottom w:w="100" w:type="dxa"/>
+              <w:left w:w="160" w:type="dxa"/>
+              <w:right w:w="160" w:type="dxa"/>
+            </w:tcMar>
+          </w:tcPr>
+          <w:p>
+            <w:pPr>
+              <w:jc w:val="left"/>
+            </w:pPr>
+            <w:r>
+              <w:rPr>
+                <w:rFonts w:ascii="Calibri" w:hAnsi="Calibri"/>
+                <w:color w:val="282C29"/>
+                <w:sz w:val="18"/>
+              </w:rPr>
+              <w:t>6.7%</w:t>
+            </w:r>
+          </w:p>
+        </w:tc>
+        <w:tc>
+          <w:tcPr>
+            <w:tcW w:type="dxa" w:w="3456"/>
+            <w:shd w:fill="FFFFFF"/>
+            <w:tcMar>
+              <w:top w:w="100" w:type="dxa"/>
+              <w:bottom w:w="100" w:type="dxa"/>
+              <w:left w:w="160" w:type="dxa"/>
+              <w:right w:w="160" w:type="dxa"/>
+            </w:tcMar>
+          </w:tcPr>
+          <w:p>
+            <w:pPr>
+              <w:jc w:val="left"/>
+            </w:pPr>
+            <w:r>
+              <w:rPr>
+                <w:rFonts w:ascii="Calibri" w:hAnsi="Calibri"/>
+                <w:color w:val="282C29"/>
+                <w:sz w:val="18"/>
+              </w:rPr>
+              <w:t>Commercial lodge kitchen, sourdough hearth bakery, solar cold storage, curing larder.</w:t>
+            </w:r>
+          </w:p>
+        </w:tc>
+      </w:tr>
+      <w:tr>
+        <w:tc>
+          <w:tcPr>
+            <w:tcW w:type="dxa" w:w="2592"/>
+            <w:shd w:fill="FAF8F5"/>
+            <w:tcMar>
+              <w:top w:w="100" w:type="dxa"/>
+              <w:bottom w:w="100" w:type="dxa"/>
+              <w:left w:w="160" w:type="dxa"/>
+              <w:right w:w="160" w:type="dxa"/>
+            </w:tcMar>
+          </w:tcPr>
+          <w:p>
+            <w:pPr>
+              <w:jc w:val="left"/>
+            </w:pPr>
+            <w:r>
+              <w:rPr>
+                <w:rFonts w:ascii="Calibri" w:hAnsi="Calibri"/>
+                <w:color w:val="282C29"/>
+                <w:sz w:val="18"/>
+              </w:rPr>
+              <w:t>Farm Produce Sale Shop</w:t>
+            </w:r>
+          </w:p>
+        </w:tc>
+        <w:tc>
+          <w:tcPr>
+            <w:tcW w:type="dxa" w:w="1440"/>
+            <w:shd w:fill="FAF8F5"/>
+            <w:tcMar>
+              <w:top w:w="100" w:type="dxa"/>
+              <w:bottom w:w="100" w:type="dxa"/>
+              <w:left w:w="160" w:type="dxa"/>
+              <w:right w:w="160" w:type="dxa"/>
+            </w:tcMar>
+          </w:tcPr>
+          <w:p>
+            <w:pPr>
+              <w:jc w:val="left"/>
+            </w:pPr>
+            <w:r>
+              <w:rPr>
+                <w:rFonts w:ascii="Calibri" w:hAnsi="Calibri"/>
+                <w:color w:val="282C29"/>
+                <w:sz w:val="18"/>
+              </w:rPr>
+              <w:t>0.30 ha</w:t>
+            </w:r>
+          </w:p>
+        </w:tc>
+        <w:tc>
+          <w:tcPr>
+            <w:tcW w:type="dxa" w:w="1440"/>
+            <w:shd w:fill="FAF8F5"/>
+            <w:tcMar>
+              <w:top w:w="100" w:type="dxa"/>
+              <w:bottom w:w="100" w:type="dxa"/>
+              <w:left w:w="160" w:type="dxa"/>
+              <w:right w:w="160" w:type="dxa"/>
+            </w:tcMar>
+          </w:tcPr>
+          <w:p>
+            <w:pPr>
+              <w:jc w:val="left"/>
+            </w:pPr>
+            <w:r>
+              <w:rPr>
+                <w:rFonts w:ascii="Calibri" w:hAnsi="Calibri"/>
+                <w:color w:val="282C29"/>
+                <w:sz w:val="18"/>
+              </w:rPr>
+              <w:t>$80,000</w:t>
+            </w:r>
+          </w:p>
+        </w:tc>
+        <w:tc>
+          <w:tcPr>
+            <w:tcW w:type="dxa" w:w="1152"/>
+            <w:shd w:fill="FAF8F5"/>
+            <w:tcMar>
+              <w:top w:w="100" w:type="dxa"/>
+              <w:bottom w:w="100" w:type="dxa"/>
+              <w:left w:w="160" w:type="dxa"/>
+              <w:right w:w="160" w:type="dxa"/>
+            </w:tcMar>
+          </w:tcPr>
+          <w:p>
+            <w:pPr>
+              <w:jc w:val="left"/>
+            </w:pPr>
+            <w:r>
+              <w:rPr>
+                <w:rFonts w:ascii="Calibri" w:hAnsi="Calibri"/>
+                <w:color w:val="282C29"/>
+                <w:sz w:val="18"/>
+              </w:rPr>
+              <w:t>3.3%</w:t>
+            </w:r>
+          </w:p>
+        </w:tc>
+        <w:tc>
+          <w:tcPr>
+            <w:tcW w:type="dxa" w:w="3456"/>
+            <w:shd w:fill="FAF8F5"/>
+            <w:tcMar>
+              <w:top w:w="100" w:type="dxa"/>
+              <w:bottom w:w="100" w:type="dxa"/>
+              <w:left w:w="160" w:type="dxa"/>
+              <w:right w:w="160" w:type="dxa"/>
+            </w:tcMar>
+          </w:tcPr>
+          <w:p>
+            <w:pPr>
+              <w:jc w:val="left"/>
+            </w:pPr>
+            <w:r>
+              <w:rPr>
+                <w:rFonts w:ascii="Calibri" w:hAnsi="Calibri"/>
+                <w:color w:val="282C29"/>
+                <w:sz w:val="18"/>
+              </w:rPr>
+              <w:t>On-site boutique retail shop selling honey, cold-pressed oils, herbal teas, preserves.</w:t>
+            </w:r>
+          </w:p>
+        </w:tc>
+      </w:tr>
+      <w:tr>
+        <w:tc>
+          <w:tcPr>
+            <w:tcW w:type="dxa" w:w="2592"/>
+            <w:shd w:fill="FFFFFF"/>
+            <w:tcMar>
+              <w:top w:w="100" w:type="dxa"/>
+              <w:bottom w:w="100" w:type="dxa"/>
+              <w:left w:w="160" w:type="dxa"/>
+              <w:right w:w="160" w:type="dxa"/>
+            </w:tcMar>
+          </w:tcPr>
+          <w:p>
+            <w:pPr>
+              <w:jc w:val="left"/>
+            </w:pPr>
+            <w:r>
+              <w:rPr>
+                <w:rFonts w:ascii="Calibri" w:hAnsi="Calibri"/>
+                <w:color w:val="282C29"/>
+                <w:sz w:val="18"/>
+              </w:rPr>
+              <w:t>SUBTOTAL GREEN ASSETS</w:t>
+            </w:r>
+          </w:p>
+        </w:tc>
+        <w:tc>
+          <w:tcPr>
+            <w:tcW w:type="dxa" w:w="1440"/>
+            <w:shd w:fill="FFFFFF"/>
+            <w:tcMar>
+              <w:top w:w="100" w:type="dxa"/>
+              <w:bottom w:w="100" w:type="dxa"/>
+              <w:left w:w="160" w:type="dxa"/>
+              <w:right w:w="160" w:type="dxa"/>
+            </w:tcMar>
+          </w:tcPr>
+          <w:p>
+            <w:pPr>
+              <w:jc w:val="left"/>
+            </w:pPr>
+            <w:r>
+              <w:rPr>
+                <w:rFonts w:ascii="Calibri" w:hAnsi="Calibri"/>
+                <w:color w:val="282C29"/>
+                <w:sz w:val="18"/>
+              </w:rPr>
+              <w:t>11.20 ha (Shared)</w:t>
+            </w:r>
+          </w:p>
+        </w:tc>
+        <w:tc>
+          <w:tcPr>
+            <w:tcW w:type="dxa" w:w="1440"/>
+            <w:shd w:fill="FFFFFF"/>
+            <w:tcMar>
+              <w:top w:w="100" w:type="dxa"/>
+              <w:bottom w:w="100" w:type="dxa"/>
+              <w:left w:w="160" w:type="dxa"/>
+              <w:right w:w="160" w:type="dxa"/>
+            </w:tcMar>
+          </w:tcPr>
+          <w:p>
+            <w:pPr>
+              <w:jc w:val="left"/>
+            </w:pPr>
+            <w:r>
+              <w:rPr>
+                <w:rFonts w:ascii="Calibri" w:hAnsi="Calibri"/>
+                <w:color w:val="282C29"/>
+                <w:sz w:val="18"/>
+              </w:rPr>
+              <w:t>$980,000</w:t>
+            </w:r>
+          </w:p>
+        </w:tc>
+        <w:tc>
+          <w:tcPr>
+            <w:tcW w:type="dxa" w:w="1152"/>
+            <w:shd w:fill="FFFFFF"/>
+            <w:tcMar>
+              <w:top w:w="100" w:type="dxa"/>
+              <w:bottom w:w="100" w:type="dxa"/>
+              <w:left w:w="160" w:type="dxa"/>
+              <w:right w:w="160" w:type="dxa"/>
+            </w:tcMar>
+          </w:tcPr>
+          <w:p>
+            <w:pPr>
+              <w:jc w:val="left"/>
+            </w:pPr>
+            <w:r>
+              <w:rPr>
+                <w:rFonts w:ascii="Calibri" w:hAnsi="Calibri"/>
+                <w:color w:val="282C29"/>
+                <w:sz w:val="18"/>
+              </w:rPr>
+              <w:t>40.8%</w:t>
+            </w:r>
+          </w:p>
+        </w:tc>
+        <w:tc>
+          <w:tcPr>
+            <w:tcW w:type="dxa" w:w="3456"/>
+            <w:shd w:fill="FFFFFF"/>
+            <w:tcMar>
+              <w:top w:w="100" w:type="dxa"/>
+              <w:bottom w:w="100" w:type="dxa"/>
+              <w:left w:w="160" w:type="dxa"/>
+              <w:right w:w="160" w:type="dxa"/>
+            </w:tcMar>
+          </w:tcPr>
+          <w:p>
+            <w:pPr>
+              <w:jc w:val="left"/>
+            </w:pPr>
+            <w:r>
+              <w:rPr>
+                <w:rFonts w:ascii="Calibri" w:hAnsi="Calibri"/>
+                <w:color w:val="282C29"/>
+                <w:sz w:val="18"/>
+              </w:rPr>
+              <w:t>Closed-loop circular engine reducing lodge opex by over 35%.</w:t>
+            </w:r>
+          </w:p>
+        </w:tc>
+      </w:tr>
+    </w:tbl>
+    <w:p>
+      <w:pPr>
+        <w:spacing w:before="80" w:after="160"/>
+      </w:pPr>
+    </w:p>
+    <w:p>
+      <w:pPr>
+        <w:pStyle w:val="Heading2"/>
+      </w:pPr>
+      <w:r>
+        <w:rPr>
+          <w:b/>
+          <w:color w:val="1B4332"/>
+        </w:rPr>
+        <w:t>Strategic Conservation Geography &amp; Wildlife Corridor Permeability</w:t>
       </w:r>
     </w:p>
     <w:p>
       <w:pPr>
-        <w:pStyle w:val="ListBullet"/>
+        <w:spacing w:after="160"/>
       </w:pPr>
       <w:r>
-        <w:t>Water storage, wastewater treatment, fire access, backup power and other essential infrastructure.</w:t>
-      </w:r>
-    </w:p>
-    <w:p>
-      <w:pPr>
-        <w:pStyle w:val="ListBullet"/>
-      </w:pPr>
-      <w:r>
-        <w:t>Landscape buffers, drainage routes, conservation/setback areas and future expansion capacity.</w:t>
-      </w:r>
-    </w:p>
-    <w:p>
-      <w:pPr>
-        <w:pStyle w:val="Heading1"/>
-      </w:pPr>
-      <w:r>
-        <w:t>Required professional inputs</w:t>
-      </w:r>
-    </w:p>
-    <w:p>
-      <w:pPr>
-        <w:pStyle w:val="ListBullet"/>
-      </w:pPr>
-      <w:r>
-        <w:t>Registered surveyor: title boundaries, levels, access and constraints.</w:t>
-      </w:r>
-    </w:p>
-    <w:p>
-      <w:pPr>
-        <w:pStyle w:val="ListBullet"/>
-      </w:pPr>
-      <w:r>
-        <w:t>Architect and engineers: concept/site plan, code compliance and buildable area.</w:t>
-      </w:r>
-    </w:p>
-    <w:p>
-      <w:pPr>
-        <w:pStyle w:val="ListBullet"/>
-      </w:pPr>
-      <w:r>
-        <w:t>Quantity surveyor: elemental cost plan, inflation, preliminaries, exclusions and contingency.</w:t>
-      </w:r>
-    </w:p>
-    <w:p>
-      <w:pPr>
-        <w:pStyle w:val="ListBullet"/>
-      </w:pPr>
-      <w:r>
-        <w:t>Environmental specialist: screening and required assessment; biodiversity and water considerations.</w:t>
-      </w:r>
-    </w:p>
-    <w:p>
-      <w:pPr>
-        <w:pStyle w:val="ListBullet"/>
-      </w:pPr>
-      <w:r>
-        <w:t>Operator/market specialist: unit mix, service model, operational adjacencies and guest journey.</w:t>
-      </w:r>
-    </w:p>
-    <w:p>
-      <w:pPr>
-        <w:pStyle w:val="Heading1"/>
-      </w:pPr>
-      <w:r>
-        <w:t>Decision gates</w:t>
-      </w:r>
-    </w:p>
-    <w:p>
-      <w:pPr>
-        <w:pStyle w:val="ListBullet"/>
-      </w:pPr>
-      <w:r>
-        <w:t>Gate 1: title/access and acquisition economics are acceptable.</w:t>
-      </w:r>
-    </w:p>
-    <w:p>
-      <w:pPr>
-        <w:pStyle w:val="ListBullet"/>
-      </w:pPr>
-      <w:r>
-        <w:t>Gate 2: planning and environmental pathway is viable.</w:t>
-      </w:r>
-    </w:p>
-    <w:p>
-      <w:pPr>
-        <w:pStyle w:val="ListBullet"/>
-      </w:pPr>
-      <w:r>
-        <w:t>Gate 3: 12-unit base case fits the US$2.4m funding envelope with contingency and working capital.</w:t>
-      </w:r>
-    </w:p>
-    <w:p>
-      <w:pPr>
-        <w:pStyle w:val="ListBullet"/>
-      </w:pPr>
-      <w:r>
-        <w:t>Gate 4: 15-unit alternative and phased option compared on risk-adjusted cash flow.</w:t>
-      </w:r>
-    </w:p>
-    <w:p>
-      <w:pPr>
-        <w:pStyle w:val="ListBullet"/>
-      </w:pPr>
-      <w:r>
-        <w:t>Gate 5: design freeze and contractor procurement only after funding and approvals are sufficiently secure.</w:t>
+        <w:t>Segera borders major neighboring wildlife zones in the Laikipia ecosystem, including the Lewa Wildlife Conservancy and Ol Pejeta Conservancy, which are globally recognized strongholds for rhinos and large predators. In strict deference to this regional ecosystem, Jonik Ndovu Farm adopts a corridor-permeable landscape architecture. Rather than hard fortress perimeter fencing that obstructs migratory pathways, the masterplan utilizes vegetative shelterbelts, contour bioswales, and natural apiary bee deterrents around productive kitchen gardens. This design allows regional plains game and elephants to transit the landscape naturally while fully safeguarding guest serenity and organic harvests.</w:t>
       </w:r>
     </w:p>
     <w:sectPr>
+      <w:headerReference w:type="default" r:id="rId9"/>
       <w:footerReference w:type="default" r:id="rId10"/>
       <w:pgSz w:w="12240" w:h="15840"/>
-      <w:pgMar w:top="936" w:right="1080" w:bottom="936" w:left="1080" w:header="720" w:footer="720" w:gutter="0"/>
+      <w:pgMar w:top="1152" w:right="1224" w:bottom="1152" w:left="1224" w:header="720" w:footer="720" w:gutter="0"/>
       <w:cols w:space="720"/>
       <w:docGrid w:linePitch="360"/>
     </w:sectPr>
@@ -283,13 +4487,33 @@
     </w:pPr>
     <w:r>
       <w:rPr>
-        <w:color w:val="65736D"/>
+        <w:rFonts w:ascii="Calibri" w:hAnsi="Calibri"/>
+        <w:color w:val="969696"/>
         <w:sz w:val="16"/>
       </w:rPr>
-      <w:t>CONFIDENTIAL WORKING DRAFT • Subject to verification, feasibility and professional due diligence</w:t>
+      <w:t>CONFIDENTIAL — FOR QUALIFIED INVESTOR REVIEW ONLY — SEGERA, LAIKIPIA, KENYA</w:t>
     </w:r>
   </w:p>
 </w:ftr>
+</file>
+
+<file path=word/header1.xml><?xml version="1.0" encoding="utf-8"?>
+<w:hdr xmlns:m="http://schemas.openxmlformats.org/officeDocument/2006/math" xmlns:mc="http://schemas.openxmlformats.org/markup-compatibility/2006" xmlns:mo="http://schemas.microsoft.com/office/mac/office/2008/main" xmlns:mv="urn:schemas-microsoft-com:mac:vml" xmlns:o="urn:schemas-microsoft-com:office:office" xmlns:r="http://schemas.openxmlformats.org/officeDocument/2006/relationships" xmlns:v="urn:schemas-microsoft-com:vml" xmlns:w10="urn:schemas-microsoft-com:office:word" xmlns:w14="http://schemas.microsoft.com/office/word/2010/wordml" xmlns:w="http://schemas.openxmlformats.org/wordprocessingml/2006/main" xmlns:wne="http://schemas.microsoft.com/office/word/2006/wordml" xmlns:wp14="http://schemas.microsoft.com/office/word/2010/wordprocessingDrawing" xmlns:wp="http://schemas.openxmlformats.org/drawingml/2006/wordprocessingDrawing" xmlns:wpc="http://schemas.microsoft.com/office/word/2010/wordprocessingCanvas" xmlns:wpg="http://schemas.microsoft.com/office/word/2010/wordprocessingGroup" xmlns:wpi="http://schemas.microsoft.com/office/word/2010/wordprocessingInk" xmlns:wps="http://schemas.microsoft.com/office/word/2010/wordprocessingShape" mc:Ignorable="w14 wp14">
+  <w:p>
+    <w:pPr>
+      <w:pStyle w:val="Header"/>
+      <w:jc w:val="right"/>
+    </w:pPr>
+    <w:r>
+      <w:rPr>
+        <w:rFonts w:ascii="Calibri" w:hAnsi="Calibri"/>
+        <w:color w:val="A88B65"/>
+        <w:sz w:val="16"/>
+      </w:rPr>
+      <w:t>JONIK NDOVU FARM · DOC-05 · TIER 3 APPROVED</w:t>
+    </w:r>
+  </w:p>
+</w:hdr>
 </file>
 
 <file path=word/numbering.xml><?xml version="1.0" encoding="utf-8"?>
@@ -655,11 +4879,6 @@
     <w:name w:val="Normal"/>
     <w:qFormat/>
     <w:rsid w:val="00FC693F"/>
-    <w:rPr>
-      <w:rFonts w:ascii="Aptos" w:hAnsi="Aptos"/>
-      <w:color w:val="23312C"/>
-      <w:sz w:val="20"/>
-    </w:rPr>
   </w:style>
   <w:style w:type="paragraph" w:styleId="Header">
     <w:name w:val="header"/>
@@ -720,11 +4939,11 @@
       <w:outlineLvl w:val="0"/>
     </w:pPr>
     <w:rPr>
-      <w:rFonts w:asciiTheme="majorHAnsi" w:eastAsiaTheme="majorEastAsia" w:hAnsiTheme="majorHAnsi" w:cstheme="majorBidi" w:ascii="Aptos Display" w:hAnsi="Aptos Display"/>
+      <w:rFonts w:asciiTheme="majorHAnsi" w:eastAsiaTheme="majorEastAsia" w:hAnsiTheme="majorHAnsi" w:cstheme="majorBidi"/>
       <w:b/>
       <w:bCs/>
-      <w:color w:val="153F35"/>
-      <w:sz w:val="38"/>
+      <w:color w:val="365F91" w:themeColor="accent1" w:themeShade="BF"/>
+      <w:sz w:val="28"/>
       <w:szCs w:val="28"/>
     </w:rPr>
   </w:style>
@@ -744,10 +4963,10 @@
       <w:outlineLvl w:val="1"/>
     </w:pPr>
     <w:rPr>
-      <w:rFonts w:asciiTheme="majorHAnsi" w:eastAsiaTheme="majorEastAsia" w:hAnsiTheme="majorHAnsi" w:cstheme="majorBidi" w:ascii="Aptos Display" w:hAnsi="Aptos Display"/>
+      <w:rFonts w:asciiTheme="majorHAnsi" w:eastAsiaTheme="majorEastAsia" w:hAnsiTheme="majorHAnsi" w:cstheme="majorBidi"/>
       <w:b/>
       <w:bCs/>
-      <w:color w:val="2F6655"/>
+      <w:color w:val="4F81BD" w:themeColor="accent1"/>
       <w:sz w:val="26"/>
       <w:szCs w:val="26"/>
     </w:rPr>
@@ -768,11 +4987,10 @@
       <w:outlineLvl w:val="2"/>
     </w:pPr>
     <w:rPr>
-      <w:rFonts w:asciiTheme="majorHAnsi" w:eastAsiaTheme="majorEastAsia" w:hAnsiTheme="majorHAnsi" w:cstheme="majorBidi" w:ascii="Aptos Display" w:hAnsi="Aptos Display"/>
+      <w:rFonts w:asciiTheme="majorHAnsi" w:eastAsiaTheme="majorEastAsia" w:hAnsiTheme="majorHAnsi" w:cstheme="majorBidi"/>
       <w:b/>
       <w:bCs/>
-      <w:color w:val="B78A4A"/>
-      <w:sz w:val="22"/>
+      <w:color w:val="4F81BD" w:themeColor="accent1"/>
     </w:rPr>
   </w:style>
   <w:style w:type="paragraph" w:styleId="Heading4">
@@ -1010,12 +5228,11 @@
       <w:contextualSpacing/>
     </w:pPr>
     <w:rPr>
-      <w:rFonts w:asciiTheme="majorHAnsi" w:eastAsiaTheme="majorEastAsia" w:hAnsiTheme="majorHAnsi" w:cstheme="majorBidi" w:ascii="Aptos Display" w:hAnsi="Aptos Display"/>
-      <w:b/>
-      <w:color w:val="153F35"/>
+      <w:rFonts w:asciiTheme="majorHAnsi" w:eastAsiaTheme="majorEastAsia" w:hAnsiTheme="majorHAnsi" w:cstheme="majorBidi"/>
+      <w:color w:val="17365D" w:themeColor="text2" w:themeShade="BF"/>
       <w:spacing w:val="5"/>
       <w:kern w:val="28"/>
-      <w:sz w:val="56"/>
+      <w:sz w:val="52"/>
       <w:szCs w:val="52"/>
     </w:rPr>
   </w:style>

</xml_diff>